<commit_message>
Fix broken table of contents in SRS document
</commit_message>
<xml_diff>
--- a/SHMS_SRS_v1.0.docx
+++ b/SHMS_SRS_v1.0.docx
@@ -476,6 +476,3510 @@
           </w:r>
         </w:p>
         <w:p>
+          <w:pPr>
+            <w:tabs>
+              <w:tab w:val="right" w:leader="dot" w:pos="9720"/>
+            </w:tabs>
+            <w:spacing w:after="60" w:line="259" w:lineRule="auto"/>
+            <w:ind w:left="0"/>
+          </w:pPr>
+          <w:hyperlink w:anchor="_Toc26" w:history="1">
+            <w:r>
+              <w:rPr>
+                <w:b/>
+                <w:bCs/>
+                <w:sz w:val="22"/>
+                <w:szCs w:val="22"/>
+              </w:rPr>
+              <w:t xml:space="preserve">1. GIỚI THIỆU</w:t>
+            </w:r>
+            <w:r>
+              <w:tab/>
+            </w:r>
+            <w:r>
+              <w:fldChar w:fldCharType="begin"/>
+            </w:r>
+            <w:r>
+              <w:instrText xml:space="preserve"> PAGEREF _Toc26 \h </w:instrText>
+            </w:r>
+            <w:r>
+              <w:fldChar w:fldCharType="separate"/>
+            </w:r>
+            <w:r>
+              <w:rPr>
+                <w:sz w:val="22"/>
+                <w:szCs w:val="22"/>
+              </w:rPr>
+              <w:t xml:space="preserve">5</w:t>
+            </w:r>
+            <w:r>
+              <w:fldChar w:fldCharType="end"/>
+            </w:r>
+          </w:hyperlink>
+        </w:p>
+        <w:p>
+          <w:pPr>
+            <w:tabs>
+              <w:tab w:val="right" w:leader="dot" w:pos="9720"/>
+            </w:tabs>
+            <w:spacing w:after="60" w:line="259" w:lineRule="auto"/>
+            <w:ind w:left="240"/>
+          </w:pPr>
+          <w:hyperlink w:anchor="_Toc27" w:history="1">
+            <w:r>
+              <w:rPr>
+                <w:sz w:val="21"/>
+                <w:szCs w:val="21"/>
+              </w:rPr>
+              <w:t xml:space="preserve">1.1. Mục đích tài liệu</w:t>
+            </w:r>
+            <w:r>
+              <w:tab/>
+            </w:r>
+            <w:r>
+              <w:fldChar w:fldCharType="begin"/>
+            </w:r>
+            <w:r>
+              <w:instrText xml:space="preserve"> PAGEREF _Toc27 \h </w:instrText>
+            </w:r>
+            <w:r>
+              <w:fldChar w:fldCharType="separate"/>
+            </w:r>
+            <w:r>
+              <w:rPr>
+                <w:sz w:val="21"/>
+                <w:szCs w:val="21"/>
+              </w:rPr>
+              <w:t xml:space="preserve">5</w:t>
+            </w:r>
+            <w:r>
+              <w:fldChar w:fldCharType="end"/>
+            </w:r>
+          </w:hyperlink>
+        </w:p>
+        <w:p>
+          <w:pPr>
+            <w:tabs>
+              <w:tab w:val="right" w:leader="dot" w:pos="9720"/>
+            </w:tabs>
+            <w:spacing w:after="60" w:line="259" w:lineRule="auto"/>
+            <w:ind w:left="240"/>
+          </w:pPr>
+          <w:hyperlink w:anchor="_Toc29" w:history="1">
+            <w:r>
+              <w:rPr>
+                <w:sz w:val="21"/>
+                <w:szCs w:val="21"/>
+              </w:rPr>
+              <w:t xml:space="preserve">1.2. Phạm vi dự án</w:t>
+            </w:r>
+            <w:r>
+              <w:tab/>
+            </w:r>
+            <w:r>
+              <w:fldChar w:fldCharType="begin"/>
+            </w:r>
+            <w:r>
+              <w:instrText xml:space="preserve"> PAGEREF _Toc29 \h </w:instrText>
+            </w:r>
+            <w:r>
+              <w:fldChar w:fldCharType="separate"/>
+            </w:r>
+            <w:r>
+              <w:rPr>
+                <w:sz w:val="21"/>
+                <w:szCs w:val="21"/>
+              </w:rPr>
+              <w:t xml:space="preserve">5</w:t>
+            </w:r>
+            <w:r>
+              <w:fldChar w:fldCharType="end"/>
+            </w:r>
+          </w:hyperlink>
+        </w:p>
+        <w:p>
+          <w:pPr>
+            <w:tabs>
+              <w:tab w:val="right" w:leader="dot" w:pos="9720"/>
+            </w:tabs>
+            <w:spacing w:after="60" w:line="259" w:lineRule="auto"/>
+            <w:ind w:left="240"/>
+          </w:pPr>
+          <w:hyperlink w:anchor="_Toc31" w:history="1">
+            <w:r>
+              <w:rPr>
+                <w:sz w:val="21"/>
+                <w:szCs w:val="21"/>
+              </w:rPr>
+              <w:t xml:space="preserve">1.3. Bối cảnh và vấn đề hiện tại</w:t>
+            </w:r>
+            <w:r>
+              <w:tab/>
+            </w:r>
+            <w:r>
+              <w:fldChar w:fldCharType="begin"/>
+            </w:r>
+            <w:r>
+              <w:instrText xml:space="preserve"> PAGEREF _Toc31 \h </w:instrText>
+            </w:r>
+            <w:r>
+              <w:fldChar w:fldCharType="separate"/>
+            </w:r>
+            <w:r>
+              <w:rPr>
+                <w:sz w:val="21"/>
+                <w:szCs w:val="21"/>
+              </w:rPr>
+              <w:t xml:space="preserve">5</w:t>
+            </w:r>
+            <w:r>
+              <w:fldChar w:fldCharType="end"/>
+            </w:r>
+          </w:hyperlink>
+        </w:p>
+        <w:p>
+          <w:pPr>
+            <w:tabs>
+              <w:tab w:val="right" w:leader="dot" w:pos="9720"/>
+            </w:tabs>
+            <w:spacing w:after="60" w:line="259" w:lineRule="auto"/>
+            <w:ind w:left="240"/>
+          </w:pPr>
+          <w:hyperlink w:anchor="_Toc38" w:history="1">
+            <w:r>
+              <w:rPr>
+                <w:sz w:val="21"/>
+                <w:szCs w:val="21"/>
+              </w:rPr>
+              <w:t xml:space="preserve">1.4. Mục tiêu dự án</w:t>
+            </w:r>
+            <w:r>
+              <w:tab/>
+            </w:r>
+            <w:r>
+              <w:fldChar w:fldCharType="begin"/>
+            </w:r>
+            <w:r>
+              <w:instrText xml:space="preserve"> PAGEREF _Toc38 \h </w:instrText>
+            </w:r>
+            <w:r>
+              <w:fldChar w:fldCharType="separate"/>
+            </w:r>
+            <w:r>
+              <w:rPr>
+                <w:sz w:val="21"/>
+                <w:szCs w:val="21"/>
+              </w:rPr>
+              <w:t xml:space="preserve">5</w:t>
+            </w:r>
+            <w:r>
+              <w:fldChar w:fldCharType="end"/>
+            </w:r>
+          </w:hyperlink>
+        </w:p>
+        <w:p>
+          <w:pPr>
+            <w:tabs>
+              <w:tab w:val="right" w:leader="dot" w:pos="9720"/>
+            </w:tabs>
+            <w:spacing w:after="60" w:line="259" w:lineRule="auto"/>
+            <w:ind w:left="240"/>
+          </w:pPr>
+          <w:hyperlink w:anchor="_Toc43" w:history="1">
+            <w:r>
+              <w:rPr>
+                <w:sz w:val="21"/>
+                <w:szCs w:val="21"/>
+              </w:rPr>
+              <w:t xml:space="preserve">1.5. Định nghĩa, thuật ngữ và từ viết tắt</w:t>
+            </w:r>
+            <w:r>
+              <w:tab/>
+            </w:r>
+            <w:r>
+              <w:fldChar w:fldCharType="begin"/>
+            </w:r>
+            <w:r>
+              <w:instrText xml:space="preserve"> PAGEREF _Toc43 \h </w:instrText>
+            </w:r>
+            <w:r>
+              <w:fldChar w:fldCharType="separate"/>
+            </w:r>
+            <w:r>
+              <w:rPr>
+                <w:sz w:val="21"/>
+                <w:szCs w:val="21"/>
+              </w:rPr>
+              <w:t xml:space="preserve">5</w:t>
+            </w:r>
+            <w:r>
+              <w:fldChar w:fldCharType="end"/>
+            </w:r>
+          </w:hyperlink>
+        </w:p>
+        <w:p>
+          <w:pPr>
+            <w:tabs>
+              <w:tab w:val="right" w:leader="dot" w:pos="9720"/>
+            </w:tabs>
+            <w:spacing w:after="60" w:line="259" w:lineRule="auto"/>
+            <w:ind w:left="240"/>
+          </w:pPr>
+          <w:hyperlink w:anchor="_Toc74" w:history="1">
+            <w:r>
+              <w:rPr>
+                <w:sz w:val="21"/>
+                <w:szCs w:val="21"/>
+              </w:rPr>
+              <w:t xml:space="preserve">1.6. Tài liệu tham khảo</w:t>
+            </w:r>
+            <w:r>
+              <w:tab/>
+            </w:r>
+            <w:r>
+              <w:fldChar w:fldCharType="begin"/>
+            </w:r>
+            <w:r>
+              <w:instrText xml:space="preserve"> PAGEREF _Toc74 \h </w:instrText>
+            </w:r>
+            <w:r>
+              <w:fldChar w:fldCharType="separate"/>
+            </w:r>
+            <w:r>
+              <w:rPr>
+                <w:sz w:val="21"/>
+                <w:szCs w:val="21"/>
+              </w:rPr>
+              <w:t xml:space="preserve">6</w:t>
+            </w:r>
+            <w:r>
+              <w:fldChar w:fldCharType="end"/>
+            </w:r>
+          </w:hyperlink>
+        </w:p>
+        <w:p>
+          <w:pPr>
+            <w:tabs>
+              <w:tab w:val="right" w:leader="dot" w:pos="9720"/>
+            </w:tabs>
+            <w:spacing w:after="60" w:line="259" w:lineRule="auto"/>
+            <w:ind w:left="0"/>
+          </w:pPr>
+          <w:hyperlink w:anchor="_Toc79" w:history="1">
+            <w:r>
+              <w:rPr>
+                <w:b/>
+                <w:bCs/>
+                <w:sz w:val="22"/>
+                <w:szCs w:val="22"/>
+              </w:rPr>
+              <w:t xml:space="preserve">2. TỔNG QUAN HỆ THỐNG VÀ VAI TRÒ NGHIỆP VỤ</w:t>
+            </w:r>
+            <w:r>
+              <w:tab/>
+            </w:r>
+            <w:r>
+              <w:fldChar w:fldCharType="begin"/>
+            </w:r>
+            <w:r>
+              <w:instrText xml:space="preserve"> PAGEREF _Toc79 \h </w:instrText>
+            </w:r>
+            <w:r>
+              <w:fldChar w:fldCharType="separate"/>
+            </w:r>
+            <w:r>
+              <w:rPr>
+                <w:sz w:val="22"/>
+                <w:szCs w:val="22"/>
+              </w:rPr>
+              <w:t xml:space="preserve">7</w:t>
+            </w:r>
+            <w:r>
+              <w:fldChar w:fldCharType="end"/>
+            </w:r>
+          </w:hyperlink>
+        </w:p>
+        <w:p>
+          <w:pPr>
+            <w:tabs>
+              <w:tab w:val="right" w:leader="dot" w:pos="9720"/>
+            </w:tabs>
+            <w:spacing w:after="60" w:line="259" w:lineRule="auto"/>
+            <w:ind w:left="240"/>
+          </w:pPr>
+          <w:hyperlink w:anchor="_Toc80" w:history="1">
+            <w:r>
+              <w:rPr>
+                <w:sz w:val="21"/>
+                <w:szCs w:val="21"/>
+              </w:rPr>
+              <w:t xml:space="preserve">2.1. Đối tượng người dùng (Business Roles / Actors)</w:t>
+            </w:r>
+            <w:r>
+              <w:tab/>
+            </w:r>
+            <w:r>
+              <w:fldChar w:fldCharType="begin"/>
+            </w:r>
+            <w:r>
+              <w:instrText xml:space="preserve"> PAGEREF _Toc80 \h </w:instrText>
+            </w:r>
+            <w:r>
+              <w:fldChar w:fldCharType="separate"/>
+            </w:r>
+            <w:r>
+              <w:rPr>
+                <w:sz w:val="21"/>
+                <w:szCs w:val="21"/>
+              </w:rPr>
+              <w:t xml:space="preserve">7</w:t>
+            </w:r>
+            <w:r>
+              <w:fldChar w:fldCharType="end"/>
+            </w:r>
+          </w:hyperlink>
+        </w:p>
+        <w:p>
+          <w:pPr>
+            <w:tabs>
+              <w:tab w:val="right" w:leader="dot" w:pos="9720"/>
+            </w:tabs>
+            <w:spacing w:after="60" w:line="259" w:lineRule="auto"/>
+            <w:ind w:left="240"/>
+          </w:pPr>
+          <w:hyperlink w:anchor="_Toc100" w:history="1">
+            <w:r>
+              <w:rPr>
+                <w:sz w:val="21"/>
+                <w:szCs w:val="21"/>
+              </w:rPr>
+              <w:t xml:space="preserve">2.2. Ràng buộc nghiệp vụ quan trọng</w:t>
+            </w:r>
+            <w:r>
+              <w:tab/>
+            </w:r>
+            <w:r>
+              <w:fldChar w:fldCharType="begin"/>
+            </w:r>
+            <w:r>
+              <w:instrText xml:space="preserve"> PAGEREF _Toc100 \h </w:instrText>
+            </w:r>
+            <w:r>
+              <w:fldChar w:fldCharType="separate"/>
+            </w:r>
+            <w:r>
+              <w:rPr>
+                <w:sz w:val="21"/>
+                <w:szCs w:val="21"/>
+              </w:rPr>
+              <w:t xml:space="preserve">7</w:t>
+            </w:r>
+            <w:r>
+              <w:fldChar w:fldCharType="end"/>
+            </w:r>
+          </w:hyperlink>
+        </w:p>
+        <w:p>
+          <w:pPr>
+            <w:tabs>
+              <w:tab w:val="right" w:leader="dot" w:pos="9720"/>
+            </w:tabs>
+            <w:spacing w:after="60" w:line="259" w:lineRule="auto"/>
+            <w:ind w:left="0"/>
+          </w:pPr>
+          <w:hyperlink w:anchor="_Toc107" w:history="1">
+            <w:r>
+              <w:rPr>
+                <w:b/>
+                <w:bCs/>
+                <w:sz w:val="22"/>
+                <w:szCs w:val="22"/>
+              </w:rPr>
+              <w:t xml:space="preserve">3. YÊU CẦU CHỨC NĂNG</w:t>
+            </w:r>
+            <w:r>
+              <w:tab/>
+            </w:r>
+            <w:r>
+              <w:fldChar w:fldCharType="begin"/>
+            </w:r>
+            <w:r>
+              <w:instrText xml:space="preserve"> PAGEREF _Toc107 \h </w:instrText>
+            </w:r>
+            <w:r>
+              <w:fldChar w:fldCharType="separate"/>
+            </w:r>
+            <w:r>
+              <w:rPr>
+                <w:sz w:val="22"/>
+                <w:szCs w:val="22"/>
+              </w:rPr>
+              <w:t xml:space="preserve">8</w:t>
+            </w:r>
+            <w:r>
+              <w:fldChar w:fldCharType="end"/>
+            </w:r>
+          </w:hyperlink>
+        </w:p>
+        <w:p>
+          <w:pPr>
+            <w:tabs>
+              <w:tab w:val="right" w:leader="dot" w:pos="9720"/>
+            </w:tabs>
+            <w:spacing w:after="60" w:line="259" w:lineRule="auto"/>
+            <w:ind w:left="240"/>
+          </w:pPr>
+          <w:hyperlink w:anchor="_Toc109" w:history="1">
+            <w:r>
+              <w:rPr>
+                <w:sz w:val="21"/>
+                <w:szCs w:val="21"/>
+              </w:rPr>
+              <w:t xml:space="preserve">3.1. Mô-đun Đăng ký &amp; Xác thực người dùng</w:t>
+            </w:r>
+            <w:r>
+              <w:tab/>
+            </w:r>
+            <w:r>
+              <w:fldChar w:fldCharType="begin"/>
+            </w:r>
+            <w:r>
+              <w:instrText xml:space="preserve"> PAGEREF _Toc109 \h </w:instrText>
+            </w:r>
+            <w:r>
+              <w:fldChar w:fldCharType="separate"/>
+            </w:r>
+            <w:r>
+              <w:rPr>
+                <w:sz w:val="21"/>
+                <w:szCs w:val="21"/>
+              </w:rPr>
+              <w:t xml:space="preserve">8</w:t>
+            </w:r>
+            <w:r>
+              <w:fldChar w:fldCharType="end"/>
+            </w:r>
+          </w:hyperlink>
+        </w:p>
+        <w:p>
+          <w:pPr>
+            <w:tabs>
+              <w:tab w:val="right" w:leader="dot" w:pos="9720"/>
+            </w:tabs>
+            <w:spacing w:after="60" w:line="259" w:lineRule="auto"/>
+            <w:ind w:left="480"/>
+          </w:pPr>
+          <w:hyperlink w:anchor="_Toc110" w:history="1">
+            <w:r>
+              <w:rPr>
+                <w:sz w:val="20"/>
+                <w:szCs w:val="20"/>
+              </w:rPr>
+              <w:t xml:space="preserve">UC-01 — Đăng ký tài khoản</w:t>
+            </w:r>
+            <w:r>
+              <w:tab/>
+            </w:r>
+            <w:r>
+              <w:fldChar w:fldCharType="begin"/>
+            </w:r>
+            <w:r>
+              <w:instrText xml:space="preserve"> PAGEREF _Toc110 \h </w:instrText>
+            </w:r>
+            <w:r>
+              <w:fldChar w:fldCharType="separate"/>
+            </w:r>
+            <w:r>
+              <w:rPr>
+                <w:sz w:val="20"/>
+                <w:szCs w:val="20"/>
+              </w:rPr>
+              <w:t xml:space="preserve">8</w:t>
+            </w:r>
+            <w:r>
+              <w:fldChar w:fldCharType="end"/>
+            </w:r>
+          </w:hyperlink>
+        </w:p>
+        <w:p>
+          <w:pPr>
+            <w:tabs>
+              <w:tab w:val="right" w:leader="dot" w:pos="9720"/>
+            </w:tabs>
+            <w:spacing w:after="60" w:line="259" w:lineRule="auto"/>
+            <w:ind w:left="480"/>
+          </w:pPr>
+          <w:hyperlink w:anchor="_Toc126" w:history="1">
+            <w:r>
+              <w:rPr>
+                <w:sz w:val="20"/>
+                <w:szCs w:val="20"/>
+              </w:rPr>
+              <w:t xml:space="preserve">UC-02 — Phê duyệt tài khoản</w:t>
+            </w:r>
+            <w:r>
+              <w:tab/>
+            </w:r>
+            <w:r>
+              <w:fldChar w:fldCharType="begin"/>
+            </w:r>
+            <w:r>
+              <w:instrText xml:space="preserve"> PAGEREF _Toc126 \h </w:instrText>
+            </w:r>
+            <w:r>
+              <w:fldChar w:fldCharType="separate"/>
+            </w:r>
+            <w:r>
+              <w:rPr>
+                <w:sz w:val="20"/>
+                <w:szCs w:val="20"/>
+              </w:rPr>
+              <w:t xml:space="preserve">8</w:t>
+            </w:r>
+            <w:r>
+              <w:fldChar w:fldCharType="end"/>
+            </w:r>
+          </w:hyperlink>
+        </w:p>
+        <w:p>
+          <w:pPr>
+            <w:tabs>
+              <w:tab w:val="right" w:leader="dot" w:pos="9720"/>
+            </w:tabs>
+            <w:spacing w:after="60" w:line="259" w:lineRule="auto"/>
+            <w:ind w:left="480"/>
+          </w:pPr>
+          <w:hyperlink w:anchor="_Toc142" w:history="1">
+            <w:r>
+              <w:rPr>
+                <w:sz w:val="20"/>
+                <w:szCs w:val="20"/>
+              </w:rPr>
+              <w:t xml:space="preserve">UC-03 — Đăng nhập (JWT)</w:t>
+            </w:r>
+            <w:r>
+              <w:tab/>
+            </w:r>
+            <w:r>
+              <w:fldChar w:fldCharType="begin"/>
+            </w:r>
+            <w:r>
+              <w:instrText xml:space="preserve"> PAGEREF _Toc142 \h </w:instrText>
+            </w:r>
+            <w:r>
+              <w:fldChar w:fldCharType="separate"/>
+            </w:r>
+            <w:r>
+              <w:rPr>
+                <w:sz w:val="20"/>
+                <w:szCs w:val="20"/>
+              </w:rPr>
+              <w:t xml:space="preserve">8</w:t>
+            </w:r>
+            <w:r>
+              <w:fldChar w:fldCharType="end"/>
+            </w:r>
+          </w:hyperlink>
+        </w:p>
+        <w:p>
+          <w:pPr>
+            <w:tabs>
+              <w:tab w:val="right" w:leader="dot" w:pos="9720"/>
+            </w:tabs>
+            <w:spacing w:after="60" w:line="259" w:lineRule="auto"/>
+            <w:ind w:left="480"/>
+          </w:pPr>
+          <w:hyperlink w:anchor="_Toc158" w:history="1">
+            <w:r>
+              <w:rPr>
+                <w:sz w:val="20"/>
+                <w:szCs w:val="20"/>
+              </w:rPr>
+              <w:t xml:space="preserve">UC-04 — Khởi tạo tài khoản Giám khảo khách mời</w:t>
+            </w:r>
+            <w:r>
+              <w:tab/>
+            </w:r>
+            <w:r>
+              <w:fldChar w:fldCharType="begin"/>
+            </w:r>
+            <w:r>
+              <w:instrText xml:space="preserve"> PAGEREF _Toc158 \h </w:instrText>
+            </w:r>
+            <w:r>
+              <w:fldChar w:fldCharType="separate"/>
+            </w:r>
+            <w:r>
+              <w:rPr>
+                <w:sz w:val="20"/>
+                <w:szCs w:val="20"/>
+              </w:rPr>
+              <w:t xml:space="preserve">9</w:t>
+            </w:r>
+            <w:r>
+              <w:fldChar w:fldCharType="end"/>
+            </w:r>
+          </w:hyperlink>
+        </w:p>
+        <w:p>
+          <w:pPr>
+            <w:tabs>
+              <w:tab w:val="right" w:leader="dot" w:pos="9720"/>
+            </w:tabs>
+            <w:spacing w:after="60" w:line="259" w:lineRule="auto"/>
+            <w:ind w:left="240"/>
+          </w:pPr>
+          <w:hyperlink w:anchor="_Toc174" w:history="1">
+            <w:r>
+              <w:rPr>
+                <w:sz w:val="21"/>
+                <w:szCs w:val="21"/>
+              </w:rPr>
+              <w:t xml:space="preserve">3.2. Mô-đun Quản lý sự kiện &amp; vòng thi</w:t>
+            </w:r>
+            <w:r>
+              <w:tab/>
+            </w:r>
+            <w:r>
+              <w:fldChar w:fldCharType="begin"/>
+            </w:r>
+            <w:r>
+              <w:instrText xml:space="preserve"> PAGEREF _Toc174 \h </w:instrText>
+            </w:r>
+            <w:r>
+              <w:fldChar w:fldCharType="separate"/>
+            </w:r>
+            <w:r>
+              <w:rPr>
+                <w:sz w:val="21"/>
+                <w:szCs w:val="21"/>
+              </w:rPr>
+              <w:t xml:space="preserve">9</w:t>
+            </w:r>
+            <w:r>
+              <w:fldChar w:fldCharType="end"/>
+            </w:r>
+          </w:hyperlink>
+        </w:p>
+        <w:p>
+          <w:pPr>
+            <w:tabs>
+              <w:tab w:val="right" w:leader="dot" w:pos="9720"/>
+            </w:tabs>
+            <w:spacing w:after="60" w:line="259" w:lineRule="auto"/>
+            <w:ind w:left="480"/>
+          </w:pPr>
+          <w:hyperlink w:anchor="_Toc175" w:history="1">
+            <w:r>
+              <w:rPr>
+                <w:sz w:val="20"/>
+                <w:szCs w:val="20"/>
+              </w:rPr>
+              <w:t xml:space="preserve">UC-05 — Tạo và quản lý sự kiện Hackathon</w:t>
+            </w:r>
+            <w:r>
+              <w:tab/>
+            </w:r>
+            <w:r>
+              <w:fldChar w:fldCharType="begin"/>
+            </w:r>
+            <w:r>
+              <w:instrText xml:space="preserve"> PAGEREF _Toc175 \h </w:instrText>
+            </w:r>
+            <w:r>
+              <w:fldChar w:fldCharType="separate"/>
+            </w:r>
+            <w:r>
+              <w:rPr>
+                <w:sz w:val="20"/>
+                <w:szCs w:val="20"/>
+              </w:rPr>
+              <w:t xml:space="preserve">9</w:t>
+            </w:r>
+            <w:r>
+              <w:fldChar w:fldCharType="end"/>
+            </w:r>
+          </w:hyperlink>
+        </w:p>
+        <w:p>
+          <w:pPr>
+            <w:tabs>
+              <w:tab w:val="right" w:leader="dot" w:pos="9720"/>
+            </w:tabs>
+            <w:spacing w:after="60" w:line="259" w:lineRule="auto"/>
+            <w:ind w:left="480"/>
+          </w:pPr>
+          <w:hyperlink w:anchor="_Toc191" w:history="1">
+            <w:r>
+              <w:rPr>
+                <w:sz w:val="20"/>
+                <w:szCs w:val="20"/>
+              </w:rPr>
+              <w:t xml:space="preserve">UC-06 — Cấu hình nhiều vòng thi trong sự kiện</w:t>
+            </w:r>
+            <w:r>
+              <w:tab/>
+            </w:r>
+            <w:r>
+              <w:fldChar w:fldCharType="begin"/>
+            </w:r>
+            <w:r>
+              <w:instrText xml:space="preserve"> PAGEREF _Toc191 \h </w:instrText>
+            </w:r>
+            <w:r>
+              <w:fldChar w:fldCharType="separate"/>
+            </w:r>
+            <w:r>
+              <w:rPr>
+                <w:sz w:val="20"/>
+                <w:szCs w:val="20"/>
+              </w:rPr>
+              <w:t xml:space="preserve">9</w:t>
+            </w:r>
+            <w:r>
+              <w:fldChar w:fldCharType="end"/>
+            </w:r>
+          </w:hyperlink>
+        </w:p>
+        <w:p>
+          <w:pPr>
+            <w:tabs>
+              <w:tab w:val="right" w:leader="dot" w:pos="9720"/>
+            </w:tabs>
+            <w:spacing w:after="60" w:line="259" w:lineRule="auto"/>
+            <w:ind w:left="240"/>
+          </w:pPr>
+          <w:hyperlink w:anchor="_Toc207" w:history="1">
+            <w:r>
+              <w:rPr>
+                <w:sz w:val="21"/>
+                <w:szCs w:val="21"/>
+              </w:rPr>
+              <w:t xml:space="preserve">3.3. Mô-đun Quản lý tiêu chí chấm điểm</w:t>
+            </w:r>
+            <w:r>
+              <w:tab/>
+            </w:r>
+            <w:r>
+              <w:fldChar w:fldCharType="begin"/>
+            </w:r>
+            <w:r>
+              <w:instrText xml:space="preserve"> PAGEREF _Toc207 \h </w:instrText>
+            </w:r>
+            <w:r>
+              <w:fldChar w:fldCharType="separate"/>
+            </w:r>
+            <w:r>
+              <w:rPr>
+                <w:sz w:val="21"/>
+                <w:szCs w:val="21"/>
+              </w:rPr>
+              <w:t xml:space="preserve">10</w:t>
+            </w:r>
+            <w:r>
+              <w:fldChar w:fldCharType="end"/>
+            </w:r>
+          </w:hyperlink>
+        </w:p>
+        <w:p>
+          <w:pPr>
+            <w:tabs>
+              <w:tab w:val="right" w:leader="dot" w:pos="9720"/>
+            </w:tabs>
+            <w:spacing w:after="60" w:line="259" w:lineRule="auto"/>
+            <w:ind w:left="480"/>
+          </w:pPr>
+          <w:hyperlink w:anchor="_Toc208" w:history="1">
+            <w:r>
+              <w:rPr>
+                <w:sz w:val="20"/>
+                <w:szCs w:val="20"/>
+              </w:rPr>
+              <w:t xml:space="preserve">UC-07 — Duy trì mẫu tiêu chí mặc định (Criteria Template)</w:t>
+            </w:r>
+            <w:r>
+              <w:tab/>
+            </w:r>
+            <w:r>
+              <w:fldChar w:fldCharType="begin"/>
+            </w:r>
+            <w:r>
+              <w:instrText xml:space="preserve"> PAGEREF _Toc208 \h </w:instrText>
+            </w:r>
+            <w:r>
+              <w:fldChar w:fldCharType="separate"/>
+            </w:r>
+            <w:r>
+              <w:rPr>
+                <w:sz w:val="20"/>
+                <w:szCs w:val="20"/>
+              </w:rPr>
+              <w:t xml:space="preserve">10</w:t>
+            </w:r>
+            <w:r>
+              <w:fldChar w:fldCharType="end"/>
+            </w:r>
+          </w:hyperlink>
+        </w:p>
+        <w:p>
+          <w:pPr>
+            <w:tabs>
+              <w:tab w:val="right" w:leader="dot" w:pos="9720"/>
+            </w:tabs>
+            <w:spacing w:after="60" w:line="259" w:lineRule="auto"/>
+            <w:ind w:left="480"/>
+          </w:pPr>
+          <w:hyperlink w:anchor="_Toc224" w:history="1">
+            <w:r>
+              <w:rPr>
+                <w:sz w:val="20"/>
+                <w:szCs w:val="20"/>
+              </w:rPr>
+              <w:t xml:space="preserve">UC-08 — Tùy chỉnh tiêu chí theo sự kiện</w:t>
+            </w:r>
+            <w:r>
+              <w:tab/>
+            </w:r>
+            <w:r>
+              <w:fldChar w:fldCharType="begin"/>
+            </w:r>
+            <w:r>
+              <w:instrText xml:space="preserve"> PAGEREF _Toc224 \h </w:instrText>
+            </w:r>
+            <w:r>
+              <w:fldChar w:fldCharType="separate"/>
+            </w:r>
+            <w:r>
+              <w:rPr>
+                <w:sz w:val="20"/>
+                <w:szCs w:val="20"/>
+              </w:rPr>
+              <w:t xml:space="preserve">10</w:t>
+            </w:r>
+            <w:r>
+              <w:fldChar w:fldCharType="end"/>
+            </w:r>
+          </w:hyperlink>
+        </w:p>
+        <w:p>
+          <w:pPr>
+            <w:tabs>
+              <w:tab w:val="right" w:leader="dot" w:pos="9720"/>
+            </w:tabs>
+            <w:spacing w:after="60" w:line="259" w:lineRule="auto"/>
+            <w:ind w:left="240"/>
+          </w:pPr>
+          <w:hyperlink w:anchor="_Toc240" w:history="1">
+            <w:r>
+              <w:rPr>
+                <w:sz w:val="21"/>
+                <w:szCs w:val="21"/>
+              </w:rPr>
+              <w:t xml:space="preserve">3.4. Mô-đun Quản lý hạng mục (Track)</w:t>
+            </w:r>
+            <w:r>
+              <w:tab/>
+            </w:r>
+            <w:r>
+              <w:fldChar w:fldCharType="begin"/>
+            </w:r>
+            <w:r>
+              <w:instrText xml:space="preserve"> PAGEREF _Toc240 \h </w:instrText>
+            </w:r>
+            <w:r>
+              <w:fldChar w:fldCharType="separate"/>
+            </w:r>
+            <w:r>
+              <w:rPr>
+                <w:sz w:val="21"/>
+                <w:szCs w:val="21"/>
+              </w:rPr>
+              <w:t xml:space="preserve">10</w:t>
+            </w:r>
+            <w:r>
+              <w:fldChar w:fldCharType="end"/>
+            </w:r>
+          </w:hyperlink>
+        </w:p>
+        <w:p>
+          <w:pPr>
+            <w:tabs>
+              <w:tab w:val="right" w:leader="dot" w:pos="9720"/>
+            </w:tabs>
+            <w:spacing w:after="60" w:line="259" w:lineRule="auto"/>
+            <w:ind w:left="480"/>
+          </w:pPr>
+          <w:hyperlink w:anchor="_Toc241" w:history="1">
+            <w:r>
+              <w:rPr>
+                <w:sz w:val="20"/>
+                <w:szCs w:val="20"/>
+              </w:rPr>
+              <w:t xml:space="preserve">UC-09 — Tạo Hạng mục thi đấu</w:t>
+            </w:r>
+            <w:r>
+              <w:tab/>
+            </w:r>
+            <w:r>
+              <w:fldChar w:fldCharType="begin"/>
+            </w:r>
+            <w:r>
+              <w:instrText xml:space="preserve"> PAGEREF _Toc241 \h </w:instrText>
+            </w:r>
+            <w:r>
+              <w:fldChar w:fldCharType="separate"/>
+            </w:r>
+            <w:r>
+              <w:rPr>
+                <w:sz w:val="20"/>
+                <w:szCs w:val="20"/>
+              </w:rPr>
+              <w:t xml:space="preserve">10</w:t>
+            </w:r>
+            <w:r>
+              <w:fldChar w:fldCharType="end"/>
+            </w:r>
+          </w:hyperlink>
+        </w:p>
+        <w:p>
+          <w:pPr>
+            <w:tabs>
+              <w:tab w:val="right" w:leader="dot" w:pos="9720"/>
+            </w:tabs>
+            <w:spacing w:after="60" w:line="259" w:lineRule="auto"/>
+            <w:ind w:left="480"/>
+          </w:pPr>
+          <w:hyperlink w:anchor="_Toc257" w:history="1">
+            <w:r>
+              <w:rPr>
+                <w:sz w:val="20"/>
+                <w:szCs w:val="20"/>
+              </w:rPr>
+              <w:t xml:space="preserve">UC-10 — Phân công Mentor cho Hạng mục</w:t>
+            </w:r>
+            <w:r>
+              <w:tab/>
+            </w:r>
+            <w:r>
+              <w:fldChar w:fldCharType="begin"/>
+            </w:r>
+            <w:r>
+              <w:instrText xml:space="preserve"> PAGEREF _Toc257 \h </w:instrText>
+            </w:r>
+            <w:r>
+              <w:fldChar w:fldCharType="separate"/>
+            </w:r>
+            <w:r>
+              <w:rPr>
+                <w:sz w:val="20"/>
+                <w:szCs w:val="20"/>
+              </w:rPr>
+              <w:t xml:space="preserve">11</w:t>
+            </w:r>
+            <w:r>
+              <w:fldChar w:fldCharType="end"/>
+            </w:r>
+          </w:hyperlink>
+        </w:p>
+        <w:p>
+          <w:pPr>
+            <w:tabs>
+              <w:tab w:val="right" w:leader="dot" w:pos="9720"/>
+            </w:tabs>
+            <w:spacing w:after="60" w:line="259" w:lineRule="auto"/>
+            <w:ind w:left="240"/>
+          </w:pPr>
+          <w:hyperlink w:anchor="_Toc273" w:history="1">
+            <w:r>
+              <w:rPr>
+                <w:sz w:val="21"/>
+                <w:szCs w:val="21"/>
+              </w:rPr>
+              <w:t xml:space="preserve">3.5. Mô-đun Quản lý đội thi</w:t>
+            </w:r>
+            <w:r>
+              <w:tab/>
+            </w:r>
+            <w:r>
+              <w:fldChar w:fldCharType="begin"/>
+            </w:r>
+            <w:r>
+              <w:instrText xml:space="preserve"> PAGEREF _Toc273 \h </w:instrText>
+            </w:r>
+            <w:r>
+              <w:fldChar w:fldCharType="separate"/>
+            </w:r>
+            <w:r>
+              <w:rPr>
+                <w:sz w:val="21"/>
+                <w:szCs w:val="21"/>
+              </w:rPr>
+              <w:t xml:space="preserve">11</w:t>
+            </w:r>
+            <w:r>
+              <w:fldChar w:fldCharType="end"/>
+            </w:r>
+          </w:hyperlink>
+        </w:p>
+        <w:p>
+          <w:pPr>
+            <w:tabs>
+              <w:tab w:val="right" w:leader="dot" w:pos="9720"/>
+            </w:tabs>
+            <w:spacing w:after="60" w:line="259" w:lineRule="auto"/>
+            <w:ind w:left="480"/>
+          </w:pPr>
+          <w:hyperlink w:anchor="_Toc274" w:history="1">
+            <w:r>
+              <w:rPr>
+                <w:sz w:val="20"/>
+                <w:szCs w:val="20"/>
+              </w:rPr>
+              <w:t xml:space="preserve">UC-11 — Thành lập đội thi</w:t>
+            </w:r>
+            <w:r>
+              <w:tab/>
+            </w:r>
+            <w:r>
+              <w:fldChar w:fldCharType="begin"/>
+            </w:r>
+            <w:r>
+              <w:instrText xml:space="preserve"> PAGEREF _Toc274 \h </w:instrText>
+            </w:r>
+            <w:r>
+              <w:fldChar w:fldCharType="separate"/>
+            </w:r>
+            <w:r>
+              <w:rPr>
+                <w:sz w:val="20"/>
+                <w:szCs w:val="20"/>
+              </w:rPr>
+              <w:t xml:space="preserve">11</w:t>
+            </w:r>
+            <w:r>
+              <w:fldChar w:fldCharType="end"/>
+            </w:r>
+          </w:hyperlink>
+        </w:p>
+        <w:p>
+          <w:pPr>
+            <w:tabs>
+              <w:tab w:val="right" w:leader="dot" w:pos="9720"/>
+            </w:tabs>
+            <w:spacing w:after="60" w:line="259" w:lineRule="auto"/>
+            <w:ind w:left="480"/>
+          </w:pPr>
+          <w:hyperlink w:anchor="_Toc290" w:history="1">
+            <w:r>
+              <w:rPr>
+                <w:sz w:val="20"/>
+                <w:szCs w:val="20"/>
+              </w:rPr>
+              <w:t xml:space="preserve">UC-12 — Đăng ký đội vào Hạng mục</w:t>
+            </w:r>
+            <w:r>
+              <w:tab/>
+            </w:r>
+            <w:r>
+              <w:fldChar w:fldCharType="begin"/>
+            </w:r>
+            <w:r>
+              <w:instrText xml:space="preserve"> PAGEREF _Toc290 \h </w:instrText>
+            </w:r>
+            <w:r>
+              <w:fldChar w:fldCharType="separate"/>
+            </w:r>
+            <w:r>
+              <w:rPr>
+                <w:sz w:val="20"/>
+                <w:szCs w:val="20"/>
+              </w:rPr>
+              <w:t xml:space="preserve">11</w:t>
+            </w:r>
+            <w:r>
+              <w:fldChar w:fldCharType="end"/>
+            </w:r>
+          </w:hyperlink>
+        </w:p>
+        <w:p>
+          <w:pPr>
+            <w:tabs>
+              <w:tab w:val="right" w:leader="dot" w:pos="9720"/>
+            </w:tabs>
+            <w:spacing w:after="60" w:line="259" w:lineRule="auto"/>
+            <w:ind w:left="240"/>
+          </w:pPr>
+          <w:hyperlink w:anchor="_Toc306" w:history="1">
+            <w:r>
+              <w:rPr>
+                <w:sz w:val="21"/>
+                <w:szCs w:val="21"/>
+              </w:rPr>
+              <w:t xml:space="preserve">3.6. Mô-đun Nộp bài (Submission)</w:t>
+            </w:r>
+            <w:r>
+              <w:tab/>
+            </w:r>
+            <w:r>
+              <w:fldChar w:fldCharType="begin"/>
+            </w:r>
+            <w:r>
+              <w:instrText xml:space="preserve"> PAGEREF _Toc306 \h </w:instrText>
+            </w:r>
+            <w:r>
+              <w:fldChar w:fldCharType="separate"/>
+            </w:r>
+            <w:r>
+              <w:rPr>
+                <w:sz w:val="21"/>
+                <w:szCs w:val="21"/>
+              </w:rPr>
+              <w:t xml:space="preserve">12</w:t>
+            </w:r>
+            <w:r>
+              <w:fldChar w:fldCharType="end"/>
+            </w:r>
+          </w:hyperlink>
+        </w:p>
+        <w:p>
+          <w:pPr>
+            <w:tabs>
+              <w:tab w:val="right" w:leader="dot" w:pos="9720"/>
+            </w:tabs>
+            <w:spacing w:after="60" w:line="259" w:lineRule="auto"/>
+            <w:ind w:left="480"/>
+          </w:pPr>
+          <w:hyperlink w:anchor="_Toc307" w:history="1">
+            <w:r>
+              <w:rPr>
+                <w:sz w:val="20"/>
+                <w:szCs w:val="20"/>
+              </w:rPr>
+              <w:t xml:space="preserve">UC-13 — Nộp bài dự thi theo vòng</w:t>
+            </w:r>
+            <w:r>
+              <w:tab/>
+            </w:r>
+            <w:r>
+              <w:fldChar w:fldCharType="begin"/>
+            </w:r>
+            <w:r>
+              <w:instrText xml:space="preserve"> PAGEREF _Toc307 \h </w:instrText>
+            </w:r>
+            <w:r>
+              <w:fldChar w:fldCharType="separate"/>
+            </w:r>
+            <w:r>
+              <w:rPr>
+                <w:sz w:val="20"/>
+                <w:szCs w:val="20"/>
+              </w:rPr>
+              <w:t xml:space="preserve">12</w:t>
+            </w:r>
+            <w:r>
+              <w:fldChar w:fldCharType="end"/>
+            </w:r>
+          </w:hyperlink>
+        </w:p>
+        <w:p>
+          <w:pPr>
+            <w:tabs>
+              <w:tab w:val="right" w:leader="dot" w:pos="9720"/>
+            </w:tabs>
+            <w:spacing w:after="60" w:line="259" w:lineRule="auto"/>
+            <w:ind w:left="480"/>
+          </w:pPr>
+          <w:hyperlink w:anchor="_Toc323" w:history="1">
+            <w:r>
+              <w:rPr>
+                <w:sz w:val="20"/>
+                <w:szCs w:val="20"/>
+              </w:rPr>
+              <w:t xml:space="preserve">UC-14 — Tự động lấy metadata repository (tuỳ chọn)</w:t>
+            </w:r>
+            <w:r>
+              <w:tab/>
+            </w:r>
+            <w:r>
+              <w:fldChar w:fldCharType="begin"/>
+            </w:r>
+            <w:r>
+              <w:instrText xml:space="preserve"> PAGEREF _Toc323 \h </w:instrText>
+            </w:r>
+            <w:r>
+              <w:fldChar w:fldCharType="separate"/>
+            </w:r>
+            <w:r>
+              <w:rPr>
+                <w:sz w:val="20"/>
+                <w:szCs w:val="20"/>
+              </w:rPr>
+              <w:t xml:space="preserve">12</w:t>
+            </w:r>
+            <w:r>
+              <w:fldChar w:fldCharType="end"/>
+            </w:r>
+          </w:hyperlink>
+        </w:p>
+        <w:p>
+          <w:pPr>
+            <w:tabs>
+              <w:tab w:val="right" w:leader="dot" w:pos="9720"/>
+            </w:tabs>
+            <w:spacing w:after="60" w:line="259" w:lineRule="auto"/>
+            <w:ind w:left="240"/>
+          </w:pPr>
+          <w:hyperlink w:anchor="_Toc339" w:history="1">
+            <w:r>
+              <w:rPr>
+                <w:sz w:val="21"/>
+                <w:szCs w:val="21"/>
+              </w:rPr>
+              <w:t xml:space="preserve">3.7. Mô-đun Đánh giá (Chấm điểm)</w:t>
+            </w:r>
+            <w:r>
+              <w:tab/>
+            </w:r>
+            <w:r>
+              <w:fldChar w:fldCharType="begin"/>
+            </w:r>
+            <w:r>
+              <w:instrText xml:space="preserve"> PAGEREF _Toc339 \h </w:instrText>
+            </w:r>
+            <w:r>
+              <w:fldChar w:fldCharType="separate"/>
+            </w:r>
+            <w:r>
+              <w:rPr>
+                <w:sz w:val="21"/>
+                <w:szCs w:val="21"/>
+              </w:rPr>
+              <w:t xml:space="preserve">12</w:t>
+            </w:r>
+            <w:r>
+              <w:fldChar w:fldCharType="end"/>
+            </w:r>
+          </w:hyperlink>
+        </w:p>
+        <w:p>
+          <w:pPr>
+            <w:tabs>
+              <w:tab w:val="right" w:leader="dot" w:pos="9720"/>
+            </w:tabs>
+            <w:spacing w:after="60" w:line="259" w:lineRule="auto"/>
+            <w:ind w:left="480"/>
+          </w:pPr>
+          <w:hyperlink w:anchor="_Toc340" w:history="1">
+            <w:r>
+              <w:rPr>
+                <w:sz w:val="20"/>
+                <w:szCs w:val="20"/>
+              </w:rPr>
+              <w:t xml:space="preserve">UC-15 — Phân công Giám khảo cho vòng thi</w:t>
+            </w:r>
+            <w:r>
+              <w:tab/>
+            </w:r>
+            <w:r>
+              <w:fldChar w:fldCharType="begin"/>
+            </w:r>
+            <w:r>
+              <w:instrText xml:space="preserve"> PAGEREF _Toc340 \h </w:instrText>
+            </w:r>
+            <w:r>
+              <w:fldChar w:fldCharType="separate"/>
+            </w:r>
+            <w:r>
+              <w:rPr>
+                <w:sz w:val="20"/>
+                <w:szCs w:val="20"/>
+              </w:rPr>
+              <w:t xml:space="preserve">12</w:t>
+            </w:r>
+            <w:r>
+              <w:fldChar w:fldCharType="end"/>
+            </w:r>
+          </w:hyperlink>
+        </w:p>
+        <w:p>
+          <w:pPr>
+            <w:tabs>
+              <w:tab w:val="right" w:leader="dot" w:pos="9720"/>
+            </w:tabs>
+            <w:spacing w:after="60" w:line="259" w:lineRule="auto"/>
+            <w:ind w:left="480"/>
+          </w:pPr>
+          <w:hyperlink w:anchor="_Toc356" w:history="1">
+            <w:r>
+              <w:rPr>
+                <w:sz w:val="20"/>
+                <w:szCs w:val="20"/>
+              </w:rPr>
+              <w:t xml:space="preserve">UC-16 — Chấm điểm bài nộp</w:t>
+            </w:r>
+            <w:r>
+              <w:tab/>
+            </w:r>
+            <w:r>
+              <w:fldChar w:fldCharType="begin"/>
+            </w:r>
+            <w:r>
+              <w:instrText xml:space="preserve"> PAGEREF _Toc356 \h </w:instrText>
+            </w:r>
+            <w:r>
+              <w:fldChar w:fldCharType="separate"/>
+            </w:r>
+            <w:r>
+              <w:rPr>
+                <w:sz w:val="20"/>
+                <w:szCs w:val="20"/>
+              </w:rPr>
+              <w:t xml:space="preserve">13</w:t>
+            </w:r>
+            <w:r>
+              <w:fldChar w:fldCharType="end"/>
+            </w:r>
+          </w:hyperlink>
+        </w:p>
+        <w:p>
+          <w:pPr>
+            <w:tabs>
+              <w:tab w:val="right" w:leader="dot" w:pos="9720"/>
+            </w:tabs>
+            <w:spacing w:after="60" w:line="259" w:lineRule="auto"/>
+            <w:ind w:left="240"/>
+          </w:pPr>
+          <w:hyperlink w:anchor="_Toc372" w:history="1">
+            <w:r>
+              <w:rPr>
+                <w:sz w:val="21"/>
+                <w:szCs w:val="21"/>
+              </w:rPr>
+              <w:t xml:space="preserve">3.8. Mô-đun Chấm điểm, Xếp hạng &amp; Loại</w:t>
+            </w:r>
+            <w:r>
+              <w:tab/>
+            </w:r>
+            <w:r>
+              <w:fldChar w:fldCharType="begin"/>
+            </w:r>
+            <w:r>
+              <w:instrText xml:space="preserve"> PAGEREF _Toc372 \h </w:instrText>
+            </w:r>
+            <w:r>
+              <w:fldChar w:fldCharType="separate"/>
+            </w:r>
+            <w:r>
+              <w:rPr>
+                <w:sz w:val="21"/>
+                <w:szCs w:val="21"/>
+              </w:rPr>
+              <w:t xml:space="preserve">13</w:t>
+            </w:r>
+            <w:r>
+              <w:fldChar w:fldCharType="end"/>
+            </w:r>
+          </w:hyperlink>
+        </w:p>
+        <w:p>
+          <w:pPr>
+            <w:tabs>
+              <w:tab w:val="right" w:leader="dot" w:pos="9720"/>
+            </w:tabs>
+            <w:spacing w:after="60" w:line="259" w:lineRule="auto"/>
+            <w:ind w:left="480"/>
+          </w:pPr>
+          <w:hyperlink w:anchor="_Toc373" w:history="1">
+            <w:r>
+              <w:rPr>
+                <w:sz w:val="20"/>
+                <w:szCs w:val="20"/>
+              </w:rPr>
+              <w:t xml:space="preserve">UC-17 — Tự động xếp hạng đội thi</w:t>
+            </w:r>
+            <w:r>
+              <w:tab/>
+            </w:r>
+            <w:r>
+              <w:fldChar w:fldCharType="begin"/>
+            </w:r>
+            <w:r>
+              <w:instrText xml:space="preserve"> PAGEREF _Toc373 \h </w:instrText>
+            </w:r>
+            <w:r>
+              <w:fldChar w:fldCharType="separate"/>
+            </w:r>
+            <w:r>
+              <w:rPr>
+                <w:sz w:val="20"/>
+                <w:szCs w:val="20"/>
+              </w:rPr>
+              <w:t xml:space="preserve">13</w:t>
+            </w:r>
+            <w:r>
+              <w:fldChar w:fldCharType="end"/>
+            </w:r>
+          </w:hyperlink>
+        </w:p>
+        <w:p>
+          <w:pPr>
+            <w:tabs>
+              <w:tab w:val="right" w:leader="dot" w:pos="9720"/>
+            </w:tabs>
+            <w:spacing w:after="60" w:line="259" w:lineRule="auto"/>
+            <w:ind w:left="480"/>
+          </w:pPr>
+          <w:hyperlink w:anchor="_Toc389" w:history="1">
+            <w:r>
+              <w:rPr>
+                <w:sz w:val="20"/>
+                <w:szCs w:val="20"/>
+              </w:rPr>
+              <w:t xml:space="preserve">UC-18 — Tính toán thăng vòng</w:t>
+            </w:r>
+            <w:r>
+              <w:tab/>
+            </w:r>
+            <w:r>
+              <w:fldChar w:fldCharType="begin"/>
+            </w:r>
+            <w:r>
+              <w:instrText xml:space="preserve"> PAGEREF _Toc389 \h </w:instrText>
+            </w:r>
+            <w:r>
+              <w:fldChar w:fldCharType="separate"/>
+            </w:r>
+            <w:r>
+              <w:rPr>
+                <w:sz w:val="20"/>
+                <w:szCs w:val="20"/>
+              </w:rPr>
+              <w:t xml:space="preserve">13</w:t>
+            </w:r>
+            <w:r>
+              <w:fldChar w:fldCharType="end"/>
+            </w:r>
+          </w:hyperlink>
+        </w:p>
+        <w:p>
+          <w:pPr>
+            <w:tabs>
+              <w:tab w:val="right" w:leader="dot" w:pos="9720"/>
+            </w:tabs>
+            <w:spacing w:after="60" w:line="259" w:lineRule="auto"/>
+            <w:ind w:left="480"/>
+          </w:pPr>
+          <w:hyperlink w:anchor="_Toc405" w:history="1">
+            <w:r>
+              <w:rPr>
+                <w:sz w:val="20"/>
+                <w:szCs w:val="20"/>
+              </w:rPr>
+              <w:t xml:space="preserve">UC-19 — Loại đội / bài nộp vi phạm quy chế</w:t>
+            </w:r>
+            <w:r>
+              <w:tab/>
+            </w:r>
+            <w:r>
+              <w:fldChar w:fldCharType="begin"/>
+            </w:r>
+            <w:r>
+              <w:instrText xml:space="preserve"> PAGEREF _Toc405 \h </w:instrText>
+            </w:r>
+            <w:r>
+              <w:fldChar w:fldCharType="separate"/>
+            </w:r>
+            <w:r>
+              <w:rPr>
+                <w:sz w:val="20"/>
+                <w:szCs w:val="20"/>
+              </w:rPr>
+              <w:t xml:space="preserve">14</w:t>
+            </w:r>
+            <w:r>
+              <w:fldChar w:fldCharType="end"/>
+            </w:r>
+          </w:hyperlink>
+        </w:p>
+        <w:p>
+          <w:pPr>
+            <w:tabs>
+              <w:tab w:val="right" w:leader="dot" w:pos="9720"/>
+            </w:tabs>
+            <w:spacing w:after="60" w:line="259" w:lineRule="auto"/>
+            <w:ind w:left="480"/>
+          </w:pPr>
+          <w:hyperlink w:anchor="_Toc421" w:history="1">
+            <w:r>
+              <w:rPr>
+                <w:sz w:val="20"/>
+                <w:szCs w:val="20"/>
+              </w:rPr>
+              <w:t xml:space="preserve">UC-20 — Nhật ký kiểm tra chấm điểm &amp; loại đội (Audit Log)</w:t>
+            </w:r>
+            <w:r>
+              <w:tab/>
+            </w:r>
+            <w:r>
+              <w:fldChar w:fldCharType="begin"/>
+            </w:r>
+            <w:r>
+              <w:instrText xml:space="preserve"> PAGEREF _Toc421 \h </w:instrText>
+            </w:r>
+            <w:r>
+              <w:fldChar w:fldCharType="separate"/>
+            </w:r>
+            <w:r>
+              <w:rPr>
+                <w:sz w:val="20"/>
+                <w:szCs w:val="20"/>
+              </w:rPr>
+              <w:t xml:space="preserve">14</w:t>
+            </w:r>
+            <w:r>
+              <w:fldChar w:fldCharType="end"/>
+            </w:r>
+          </w:hyperlink>
+        </w:p>
+        <w:p>
+          <w:pPr>
+            <w:tabs>
+              <w:tab w:val="right" w:leader="dot" w:pos="9720"/>
+            </w:tabs>
+            <w:spacing w:after="60" w:line="259" w:lineRule="auto"/>
+            <w:ind w:left="240"/>
+          </w:pPr>
+          <w:hyperlink w:anchor="_Toc437" w:history="1">
+            <w:r>
+              <w:rPr>
+                <w:sz w:val="21"/>
+                <w:szCs w:val="21"/>
+              </w:rPr>
+              <w:t xml:space="preserve">3.9. Mô-đun Thu thập dữ liệu nghiên cứu (RBL)</w:t>
+            </w:r>
+            <w:r>
+              <w:tab/>
+            </w:r>
+            <w:r>
+              <w:fldChar w:fldCharType="begin"/>
+            </w:r>
+            <w:r>
+              <w:instrText xml:space="preserve"> PAGEREF _Toc437 \h </w:instrText>
+            </w:r>
+            <w:r>
+              <w:fldChar w:fldCharType="separate"/>
+            </w:r>
+            <w:r>
+              <w:rPr>
+                <w:sz w:val="21"/>
+                <w:szCs w:val="21"/>
+              </w:rPr>
+              <w:t xml:space="preserve">14</w:t>
+            </w:r>
+            <w:r>
+              <w:fldChar w:fldCharType="end"/>
+            </w:r>
+          </w:hyperlink>
+        </w:p>
+        <w:p>
+          <w:pPr>
+            <w:tabs>
+              <w:tab w:val="right" w:leader="dot" w:pos="9720"/>
+            </w:tabs>
+            <w:spacing w:after="60" w:line="259" w:lineRule="auto"/>
+            <w:ind w:left="480"/>
+          </w:pPr>
+          <w:hyperlink w:anchor="_Toc439" w:history="1">
+            <w:r>
+              <w:rPr>
+                <w:sz w:val="20"/>
+                <w:szCs w:val="20"/>
+              </w:rPr>
+              <w:t xml:space="preserve">UC-21 — Ghi điểm chi tiết từng giám khảo/tiêu chí (không gộp)</w:t>
+            </w:r>
+            <w:r>
+              <w:tab/>
+            </w:r>
+            <w:r>
+              <w:fldChar w:fldCharType="begin"/>
+            </w:r>
+            <w:r>
+              <w:instrText xml:space="preserve"> PAGEREF _Toc439 \h </w:instrText>
+            </w:r>
+            <w:r>
+              <w:fldChar w:fldCharType="separate"/>
+            </w:r>
+            <w:r>
+              <w:rPr>
+                <w:sz w:val="20"/>
+                <w:szCs w:val="20"/>
+              </w:rPr>
+              <w:t xml:space="preserve">15</w:t>
+            </w:r>
+            <w:r>
+              <w:fldChar w:fldCharType="end"/>
+            </w:r>
+          </w:hyperlink>
+        </w:p>
+        <w:p>
+          <w:pPr>
+            <w:tabs>
+              <w:tab w:val="right" w:leader="dot" w:pos="9720"/>
+            </w:tabs>
+            <w:spacing w:after="60" w:line="259" w:lineRule="auto"/>
+            <w:ind w:left="480"/>
+          </w:pPr>
+          <w:hyperlink w:anchor="_Toc455" w:history="1">
+            <w:r>
+              <w:rPr>
+                <w:sz w:val="20"/>
+                <w:szCs w:val="20"/>
+              </w:rPr>
+              <w:t xml:space="preserve">UC-22 — Vòng hiệu chuẩn (Calibration Round)</w:t>
+            </w:r>
+            <w:r>
+              <w:tab/>
+            </w:r>
+            <w:r>
+              <w:fldChar w:fldCharType="begin"/>
+            </w:r>
+            <w:r>
+              <w:instrText xml:space="preserve"> PAGEREF _Toc455 \h </w:instrText>
+            </w:r>
+            <w:r>
+              <w:fldChar w:fldCharType="separate"/>
+            </w:r>
+            <w:r>
+              <w:rPr>
+                <w:sz w:val="20"/>
+                <w:szCs w:val="20"/>
+              </w:rPr>
+              <w:t xml:space="preserve">15</w:t>
+            </w:r>
+            <w:r>
+              <w:fldChar w:fldCharType="end"/>
+            </w:r>
+          </w:hyperlink>
+        </w:p>
+        <w:p>
+          <w:pPr>
+            <w:tabs>
+              <w:tab w:val="right" w:leader="dot" w:pos="9720"/>
+            </w:tabs>
+            <w:spacing w:after="60" w:line="259" w:lineRule="auto"/>
+            <w:ind w:left="480"/>
+          </w:pPr>
+          <w:hyperlink w:anchor="_Toc471" w:history="1">
+            <w:r>
+              <w:rPr>
+                <w:sz w:val="20"/>
+                <w:szCs w:val="20"/>
+              </w:rPr>
+              <w:t xml:space="preserve">UC-23 — Xuất dữ liệu chấm điểm đã ẩn danh (CSV)</w:t>
+            </w:r>
+            <w:r>
+              <w:tab/>
+            </w:r>
+            <w:r>
+              <w:fldChar w:fldCharType="begin"/>
+            </w:r>
+            <w:r>
+              <w:instrText xml:space="preserve"> PAGEREF _Toc471 \h </w:instrText>
+            </w:r>
+            <w:r>
+              <w:fldChar w:fldCharType="separate"/>
+            </w:r>
+            <w:r>
+              <w:rPr>
+                <w:sz w:val="20"/>
+                <w:szCs w:val="20"/>
+              </w:rPr>
+              <w:t xml:space="preserve">15</w:t>
+            </w:r>
+            <w:r>
+              <w:fldChar w:fldCharType="end"/>
+            </w:r>
+          </w:hyperlink>
+        </w:p>
+        <w:p>
+          <w:pPr>
+            <w:tabs>
+              <w:tab w:val="right" w:leader="dot" w:pos="9720"/>
+            </w:tabs>
+            <w:spacing w:after="60" w:line="259" w:lineRule="auto"/>
+            <w:ind w:left="480"/>
+          </w:pPr>
+          <w:hyperlink w:anchor="_Toc487" w:history="1">
+            <w:r>
+              <w:rPr>
+                <w:sz w:val="20"/>
+                <w:szCs w:val="20"/>
+              </w:rPr>
+              <w:t xml:space="preserve">UC-24 — Dashboard phương sai điểm giữa các giám khảo</w:t>
+            </w:r>
+            <w:r>
+              <w:tab/>
+            </w:r>
+            <w:r>
+              <w:fldChar w:fldCharType="begin"/>
+            </w:r>
+            <w:r>
+              <w:instrText xml:space="preserve"> PAGEREF _Toc487 \h </w:instrText>
+            </w:r>
+            <w:r>
+              <w:fldChar w:fldCharType="separate"/>
+            </w:r>
+            <w:r>
+              <w:rPr>
+                <w:sz w:val="20"/>
+                <w:szCs w:val="20"/>
+              </w:rPr>
+              <w:t xml:space="preserve">16</w:t>
+            </w:r>
+            <w:r>
+              <w:fldChar w:fldCharType="end"/>
+            </w:r>
+          </w:hyperlink>
+        </w:p>
+        <w:p>
+          <w:pPr>
+            <w:tabs>
+              <w:tab w:val="right" w:leader="dot" w:pos="9720"/>
+            </w:tabs>
+            <w:spacing w:after="60" w:line="259" w:lineRule="auto"/>
+            <w:ind w:left="240"/>
+          </w:pPr>
+          <w:hyperlink w:anchor="_Toc503" w:history="1">
+            <w:r>
+              <w:rPr>
+                <w:sz w:val="21"/>
+                <w:szCs w:val="21"/>
+              </w:rPr>
+              <w:t xml:space="preserve">3.10. Mô-đun Giải thưởng &amp; Thông báo kết quả</w:t>
+            </w:r>
+            <w:r>
+              <w:tab/>
+            </w:r>
+            <w:r>
+              <w:fldChar w:fldCharType="begin"/>
+            </w:r>
+            <w:r>
+              <w:instrText xml:space="preserve"> PAGEREF _Toc503 \h </w:instrText>
+            </w:r>
+            <w:r>
+              <w:fldChar w:fldCharType="separate"/>
+            </w:r>
+            <w:r>
+              <w:rPr>
+                <w:sz w:val="21"/>
+                <w:szCs w:val="21"/>
+              </w:rPr>
+              <w:t xml:space="preserve">16</w:t>
+            </w:r>
+            <w:r>
+              <w:fldChar w:fldCharType="end"/>
+            </w:r>
+          </w:hyperlink>
+        </w:p>
+        <w:p>
+          <w:pPr>
+            <w:tabs>
+              <w:tab w:val="right" w:leader="dot" w:pos="9720"/>
+            </w:tabs>
+            <w:spacing w:after="60" w:line="259" w:lineRule="auto"/>
+            <w:ind w:left="480"/>
+          </w:pPr>
+          <w:hyperlink w:anchor="_Toc504" w:history="1">
+            <w:r>
+              <w:rPr>
+                <w:sz w:val="20"/>
+                <w:szCs w:val="20"/>
+              </w:rPr>
+              <w:t xml:space="preserve">UC-25 — Trao giải dựa trên kết quả xếp hạng</w:t>
+            </w:r>
+            <w:r>
+              <w:tab/>
+            </w:r>
+            <w:r>
+              <w:fldChar w:fldCharType="begin"/>
+            </w:r>
+            <w:r>
+              <w:instrText xml:space="preserve"> PAGEREF _Toc504 \h </w:instrText>
+            </w:r>
+            <w:r>
+              <w:fldChar w:fldCharType="separate"/>
+            </w:r>
+            <w:r>
+              <w:rPr>
+                <w:sz w:val="20"/>
+                <w:szCs w:val="20"/>
+              </w:rPr>
+              <w:t xml:space="preserve">16</w:t>
+            </w:r>
+            <w:r>
+              <w:fldChar w:fldCharType="end"/>
+            </w:r>
+          </w:hyperlink>
+        </w:p>
+        <w:p>
+          <w:pPr>
+            <w:tabs>
+              <w:tab w:val="right" w:leader="dot" w:pos="9720"/>
+            </w:tabs>
+            <w:spacing w:after="60" w:line="259" w:lineRule="auto"/>
+            <w:ind w:left="480"/>
+          </w:pPr>
+          <w:hyperlink w:anchor="_Toc520" w:history="1">
+            <w:r>
+              <w:rPr>
+                <w:sz w:val="20"/>
+                <w:szCs w:val="20"/>
+              </w:rPr>
+              <w:t xml:space="preserve">UC-26 — Thông báo &amp; công bố kết quả</w:t>
+            </w:r>
+            <w:r>
+              <w:tab/>
+            </w:r>
+            <w:r>
+              <w:fldChar w:fldCharType="begin"/>
+            </w:r>
+            <w:r>
+              <w:instrText xml:space="preserve"> PAGEREF _Toc520 \h </w:instrText>
+            </w:r>
+            <w:r>
+              <w:fldChar w:fldCharType="separate"/>
+            </w:r>
+            <w:r>
+              <w:rPr>
+                <w:sz w:val="20"/>
+                <w:szCs w:val="20"/>
+              </w:rPr>
+              <w:t xml:space="preserve">16</w:t>
+            </w:r>
+            <w:r>
+              <w:fldChar w:fldCharType="end"/>
+            </w:r>
+          </w:hyperlink>
+        </w:p>
+        <w:p>
+          <w:pPr>
+            <w:tabs>
+              <w:tab w:val="right" w:leader="dot" w:pos="9720"/>
+            </w:tabs>
+            <w:spacing w:after="60" w:line="259" w:lineRule="auto"/>
+            <w:ind w:left="480"/>
+          </w:pPr>
+          <w:hyperlink w:anchor="_Toc536" w:history="1">
+            <w:r>
+              <w:rPr>
+                <w:sz w:val="20"/>
+                <w:szCs w:val="20"/>
+              </w:rPr>
+              <w:t xml:space="preserve">UC-27 — Xuất báo cáo xếp hạng và điểm (CSV/Excel)</w:t>
+            </w:r>
+            <w:r>
+              <w:tab/>
+            </w:r>
+            <w:r>
+              <w:fldChar w:fldCharType="begin"/>
+            </w:r>
+            <w:r>
+              <w:instrText xml:space="preserve"> PAGEREF _Toc536 \h </w:instrText>
+            </w:r>
+            <w:r>
+              <w:fldChar w:fldCharType="separate"/>
+            </w:r>
+            <w:r>
+              <w:rPr>
+                <w:sz w:val="20"/>
+                <w:szCs w:val="20"/>
+              </w:rPr>
+              <w:t xml:space="preserve">17</w:t>
+            </w:r>
+            <w:r>
+              <w:fldChar w:fldCharType="end"/>
+            </w:r>
+          </w:hyperlink>
+        </w:p>
+        <w:p>
+          <w:pPr>
+            <w:tabs>
+              <w:tab w:val="right" w:leader="dot" w:pos="9720"/>
+            </w:tabs>
+            <w:spacing w:after="60" w:line="259" w:lineRule="auto"/>
+            <w:ind w:left="0"/>
+          </w:pPr>
+          <w:hyperlink w:anchor="_Toc553" w:history="1">
+            <w:r>
+              <w:rPr>
+                <w:b/>
+                <w:bCs/>
+                <w:sz w:val="22"/>
+                <w:szCs w:val="22"/>
+              </w:rPr>
+              <w:t xml:space="preserve">4. MA TRẬN PHÂN QUYỀN (ROLE-BASED ACCESS MATRIX)</w:t>
+            </w:r>
+            <w:r>
+              <w:tab/>
+            </w:r>
+            <w:r>
+              <w:fldChar w:fldCharType="begin"/>
+            </w:r>
+            <w:r>
+              <w:instrText xml:space="preserve"> PAGEREF _Toc553 \h </w:instrText>
+            </w:r>
+            <w:r>
+              <w:fldChar w:fldCharType="separate"/>
+            </w:r>
+            <w:r>
+              <w:rPr>
+                <w:sz w:val="22"/>
+                <w:szCs w:val="22"/>
+              </w:rPr>
+              <w:t xml:space="preserve">18</w:t>
+            </w:r>
+            <w:r>
+              <w:fldChar w:fldCharType="end"/>
+            </w:r>
+          </w:hyperlink>
+        </w:p>
+        <w:p>
+          <w:pPr>
+            <w:tabs>
+              <w:tab w:val="right" w:leader="dot" w:pos="9720"/>
+            </w:tabs>
+            <w:spacing w:after="60" w:line="259" w:lineRule="auto"/>
+            <w:ind w:left="0"/>
+          </w:pPr>
+          <w:hyperlink w:anchor="_Toc664" w:history="1">
+            <w:r>
+              <w:rPr>
+                <w:b/>
+                <w:bCs/>
+                <w:sz w:val="22"/>
+                <w:szCs w:val="22"/>
+              </w:rPr>
+              <w:t xml:space="preserve">5. YÊU CẦU PHI CHỨC NĂNG</w:t>
+            </w:r>
+            <w:r>
+              <w:tab/>
+            </w:r>
+            <w:r>
+              <w:fldChar w:fldCharType="begin"/>
+            </w:r>
+            <w:r>
+              <w:instrText xml:space="preserve"> PAGEREF _Toc664 \h </w:instrText>
+            </w:r>
+            <w:r>
+              <w:fldChar w:fldCharType="separate"/>
+            </w:r>
+            <w:r>
+              <w:rPr>
+                <w:sz w:val="22"/>
+                <w:szCs w:val="22"/>
+              </w:rPr>
+              <w:t xml:space="preserve">19</w:t>
+            </w:r>
+            <w:r>
+              <w:fldChar w:fldCharType="end"/>
+            </w:r>
+          </w:hyperlink>
+        </w:p>
+        <w:p>
+          <w:pPr>
+            <w:tabs>
+              <w:tab w:val="right" w:leader="dot" w:pos="9720"/>
+            </w:tabs>
+            <w:spacing w:after="60" w:line="259" w:lineRule="auto"/>
+            <w:ind w:left="240"/>
+          </w:pPr>
+          <w:hyperlink w:anchor="_Toc665" w:history="1">
+            <w:r>
+              <w:rPr>
+                <w:sz w:val="21"/>
+                <w:szCs w:val="21"/>
+              </w:rPr>
+              <w:t xml:space="preserve">5.1. Bảo mật</w:t>
+            </w:r>
+            <w:r>
+              <w:tab/>
+            </w:r>
+            <w:r>
+              <w:fldChar w:fldCharType="begin"/>
+            </w:r>
+            <w:r>
+              <w:instrText xml:space="preserve"> PAGEREF _Toc665 \h </w:instrText>
+            </w:r>
+            <w:r>
+              <w:fldChar w:fldCharType="separate"/>
+            </w:r>
+            <w:r>
+              <w:rPr>
+                <w:sz w:val="21"/>
+                <w:szCs w:val="21"/>
+              </w:rPr>
+              <w:t xml:space="preserve">19</w:t>
+            </w:r>
+            <w:r>
+              <w:fldChar w:fldCharType="end"/>
+            </w:r>
+          </w:hyperlink>
+        </w:p>
+        <w:p>
+          <w:pPr>
+            <w:tabs>
+              <w:tab w:val="right" w:leader="dot" w:pos="9720"/>
+            </w:tabs>
+            <w:spacing w:after="60" w:line="259" w:lineRule="auto"/>
+            <w:ind w:left="240"/>
+          </w:pPr>
+          <w:hyperlink w:anchor="_Toc670" w:history="1">
+            <w:r>
+              <w:rPr>
+                <w:sz w:val="21"/>
+                <w:szCs w:val="21"/>
+              </w:rPr>
+              <w:t xml:space="preserve">5.2. Hiệu năng</w:t>
+            </w:r>
+            <w:r>
+              <w:tab/>
+            </w:r>
+            <w:r>
+              <w:fldChar w:fldCharType="begin"/>
+            </w:r>
+            <w:r>
+              <w:instrText xml:space="preserve"> PAGEREF _Toc670 \h </w:instrText>
+            </w:r>
+            <w:r>
+              <w:fldChar w:fldCharType="separate"/>
+            </w:r>
+            <w:r>
+              <w:rPr>
+                <w:sz w:val="21"/>
+                <w:szCs w:val="21"/>
+              </w:rPr>
+              <w:t xml:space="preserve">19</w:t>
+            </w:r>
+            <w:r>
+              <w:fldChar w:fldCharType="end"/>
+            </w:r>
+          </w:hyperlink>
+        </w:p>
+        <w:p>
+          <w:pPr>
+            <w:tabs>
+              <w:tab w:val="right" w:leader="dot" w:pos="9720"/>
+            </w:tabs>
+            <w:spacing w:after="60" w:line="259" w:lineRule="auto"/>
+            <w:ind w:left="240"/>
+          </w:pPr>
+          <w:hyperlink w:anchor="_Toc673" w:history="1">
+            <w:r>
+              <w:rPr>
+                <w:sz w:val="21"/>
+                <w:szCs w:val="21"/>
+              </w:rPr>
+              <w:t xml:space="preserve">5.3. Khả năng mở rộng &amp; bảo trì</w:t>
+            </w:r>
+            <w:r>
+              <w:tab/>
+            </w:r>
+            <w:r>
+              <w:fldChar w:fldCharType="begin"/>
+            </w:r>
+            <w:r>
+              <w:instrText xml:space="preserve"> PAGEREF _Toc673 \h </w:instrText>
+            </w:r>
+            <w:r>
+              <w:fldChar w:fldCharType="separate"/>
+            </w:r>
+            <w:r>
+              <w:rPr>
+                <w:sz w:val="21"/>
+                <w:szCs w:val="21"/>
+              </w:rPr>
+              <w:t xml:space="preserve">19</w:t>
+            </w:r>
+            <w:r>
+              <w:fldChar w:fldCharType="end"/>
+            </w:r>
+          </w:hyperlink>
+        </w:p>
+        <w:p>
+          <w:pPr>
+            <w:tabs>
+              <w:tab w:val="right" w:leader="dot" w:pos="9720"/>
+            </w:tabs>
+            <w:spacing w:after="60" w:line="259" w:lineRule="auto"/>
+            <w:ind w:left="240"/>
+          </w:pPr>
+          <w:hyperlink w:anchor="_Toc676" w:history="1">
+            <w:r>
+              <w:rPr>
+                <w:sz w:val="21"/>
+                <w:szCs w:val="21"/>
+              </w:rPr>
+              <w:t xml:space="preserve">5.4. Khả dụng &amp; sao lưu dữ liệu</w:t>
+            </w:r>
+            <w:r>
+              <w:tab/>
+            </w:r>
+            <w:r>
+              <w:fldChar w:fldCharType="begin"/>
+            </w:r>
+            <w:r>
+              <w:instrText xml:space="preserve"> PAGEREF _Toc676 \h </w:instrText>
+            </w:r>
+            <w:r>
+              <w:fldChar w:fldCharType="separate"/>
+            </w:r>
+            <w:r>
+              <w:rPr>
+                <w:sz w:val="21"/>
+                <w:szCs w:val="21"/>
+              </w:rPr>
+              <w:t xml:space="preserve">19</w:t>
+            </w:r>
+            <w:r>
+              <w:fldChar w:fldCharType="end"/>
+            </w:r>
+          </w:hyperlink>
+        </w:p>
+        <w:p>
+          <w:pPr>
+            <w:tabs>
+              <w:tab w:val="right" w:leader="dot" w:pos="9720"/>
+            </w:tabs>
+            <w:spacing w:after="60" w:line="259" w:lineRule="auto"/>
+            <w:ind w:left="240"/>
+          </w:pPr>
+          <w:hyperlink w:anchor="_Toc679" w:history="1">
+            <w:r>
+              <w:rPr>
+                <w:sz w:val="21"/>
+                <w:szCs w:val="21"/>
+              </w:rPr>
+              <w:t xml:space="preserve">5.5. Nhật ký kiểm tra &amp; minh bạch</w:t>
+            </w:r>
+            <w:r>
+              <w:tab/>
+            </w:r>
+            <w:r>
+              <w:fldChar w:fldCharType="begin"/>
+            </w:r>
+            <w:r>
+              <w:instrText xml:space="preserve"> PAGEREF _Toc679 \h </w:instrText>
+            </w:r>
+            <w:r>
+              <w:fldChar w:fldCharType="separate"/>
+            </w:r>
+            <w:r>
+              <w:rPr>
+                <w:sz w:val="21"/>
+                <w:szCs w:val="21"/>
+              </w:rPr>
+              <w:t xml:space="preserve">19</w:t>
+            </w:r>
+            <w:r>
+              <w:fldChar w:fldCharType="end"/>
+            </w:r>
+          </w:hyperlink>
+        </w:p>
+        <w:p>
+          <w:pPr>
+            <w:tabs>
+              <w:tab w:val="right" w:leader="dot" w:pos="9720"/>
+            </w:tabs>
+            <w:spacing w:after="60" w:line="259" w:lineRule="auto"/>
+            <w:ind w:left="240"/>
+          </w:pPr>
+          <w:hyperlink w:anchor="_Toc682" w:history="1">
+            <w:r>
+              <w:rPr>
+                <w:sz w:val="21"/>
+                <w:szCs w:val="21"/>
+              </w:rPr>
+              <w:t xml:space="preserve">5.6. Khả năng sử dụng (Usability)</w:t>
+            </w:r>
+            <w:r>
+              <w:tab/>
+            </w:r>
+            <w:r>
+              <w:fldChar w:fldCharType="begin"/>
+            </w:r>
+            <w:r>
+              <w:instrText xml:space="preserve"> PAGEREF _Toc682 \h </w:instrText>
+            </w:r>
+            <w:r>
+              <w:fldChar w:fldCharType="separate"/>
+            </w:r>
+            <w:r>
+              <w:rPr>
+                <w:sz w:val="21"/>
+                <w:szCs w:val="21"/>
+              </w:rPr>
+              <w:t xml:space="preserve">19</w:t>
+            </w:r>
+            <w:r>
+              <w:fldChar w:fldCharType="end"/>
+            </w:r>
+          </w:hyperlink>
+        </w:p>
+        <w:p>
+          <w:pPr>
+            <w:tabs>
+              <w:tab w:val="right" w:leader="dot" w:pos="9720"/>
+            </w:tabs>
+            <w:spacing w:after="60" w:line="259" w:lineRule="auto"/>
+            <w:ind w:left="240"/>
+          </w:pPr>
+          <w:hyperlink w:anchor="_Toc685" w:history="1">
+            <w:r>
+              <w:rPr>
+                <w:sz w:val="21"/>
+                <w:szCs w:val="21"/>
+              </w:rPr>
+              <w:t xml:space="preserve">5.7. Quốc tế hoá &amp; ngôn ngữ</w:t>
+            </w:r>
+            <w:r>
+              <w:tab/>
+            </w:r>
+            <w:r>
+              <w:fldChar w:fldCharType="begin"/>
+            </w:r>
+            <w:r>
+              <w:instrText xml:space="preserve"> PAGEREF _Toc685 \h </w:instrText>
+            </w:r>
+            <w:r>
+              <w:fldChar w:fldCharType="separate"/>
+            </w:r>
+            <w:r>
+              <w:rPr>
+                <w:sz w:val="21"/>
+                <w:szCs w:val="21"/>
+              </w:rPr>
+              <w:t xml:space="preserve">19</w:t>
+            </w:r>
+            <w:r>
+              <w:fldChar w:fldCharType="end"/>
+            </w:r>
+          </w:hyperlink>
+        </w:p>
+        <w:p>
+          <w:pPr>
+            <w:tabs>
+              <w:tab w:val="right" w:leader="dot" w:pos="9720"/>
+            </w:tabs>
+            <w:spacing w:after="60" w:line="259" w:lineRule="auto"/>
+            <w:ind w:left="0"/>
+          </w:pPr>
+          <w:hyperlink w:anchor="_Toc688" w:history="1">
+            <w:r>
+              <w:rPr>
+                <w:b/>
+                <w:bCs/>
+                <w:sz w:val="22"/>
+                <w:szCs w:val="22"/>
+              </w:rPr>
+              <w:t xml:space="preserve">6. MÔ HÌNH DỮ LIỆU (DOMAIN MODEL)</w:t>
+            </w:r>
+            <w:r>
+              <w:tab/>
+            </w:r>
+            <w:r>
+              <w:fldChar w:fldCharType="begin"/>
+            </w:r>
+            <w:r>
+              <w:instrText xml:space="preserve"> PAGEREF _Toc688 \h </w:instrText>
+            </w:r>
+            <w:r>
+              <w:fldChar w:fldCharType="separate"/>
+            </w:r>
+            <w:r>
+              <w:rPr>
+                <w:sz w:val="22"/>
+                <w:szCs w:val="22"/>
+              </w:rPr>
+              <w:t xml:space="preserve">20</w:t>
+            </w:r>
+            <w:r>
+              <w:fldChar w:fldCharType="end"/>
+            </w:r>
+          </w:hyperlink>
+        </w:p>
+        <w:p>
+          <w:pPr>
+            <w:tabs>
+              <w:tab w:val="right" w:leader="dot" w:pos="9720"/>
+            </w:tabs>
+            <w:spacing w:after="60" w:line="259" w:lineRule="auto"/>
+            <w:ind w:left="240"/>
+          </w:pPr>
+          <w:hyperlink w:anchor="_Toc690" w:history="1">
+            <w:r>
+              <w:rPr>
+                <w:sz w:val="21"/>
+                <w:szCs w:val="21"/>
+              </w:rPr>
+              <w:t xml:space="preserve">6.1. Danh sách thực thể chính</w:t>
+            </w:r>
+            <w:r>
+              <w:tab/>
+            </w:r>
+            <w:r>
+              <w:fldChar w:fldCharType="begin"/>
+            </w:r>
+            <w:r>
+              <w:instrText xml:space="preserve"> PAGEREF _Toc690 \h </w:instrText>
+            </w:r>
+            <w:r>
+              <w:fldChar w:fldCharType="separate"/>
+            </w:r>
+            <w:r>
+              <w:rPr>
+                <w:sz w:val="21"/>
+                <w:szCs w:val="21"/>
+              </w:rPr>
+              <w:t xml:space="preserve">20</w:t>
+            </w:r>
+            <w:r>
+              <w:fldChar w:fldCharType="end"/>
+            </w:r>
+          </w:hyperlink>
+        </w:p>
+        <w:p>
+          <w:pPr>
+            <w:tabs>
+              <w:tab w:val="right" w:leader="dot" w:pos="9720"/>
+            </w:tabs>
+            <w:spacing w:after="60" w:line="259" w:lineRule="auto"/>
+            <w:ind w:left="480"/>
+          </w:pPr>
+          <w:hyperlink w:anchor="_Toc691" w:history="1">
+            <w:r>
+              <w:rPr>
+                <w:sz w:val="20"/>
+                <w:szCs w:val="20"/>
+              </w:rPr>
+              <w:t xml:space="preserve">User (Người dùng)</w:t>
+            </w:r>
+            <w:r>
+              <w:tab/>
+            </w:r>
+            <w:r>
+              <w:fldChar w:fldCharType="begin"/>
+            </w:r>
+            <w:r>
+              <w:instrText xml:space="preserve"> PAGEREF _Toc691 \h </w:instrText>
+            </w:r>
+            <w:r>
+              <w:fldChar w:fldCharType="separate"/>
+            </w:r>
+            <w:r>
+              <w:rPr>
+                <w:sz w:val="20"/>
+                <w:szCs w:val="20"/>
+              </w:rPr>
+              <w:t xml:space="preserve">20</w:t>
+            </w:r>
+            <w:r>
+              <w:fldChar w:fldCharType="end"/>
+            </w:r>
+          </w:hyperlink>
+        </w:p>
+        <w:p>
+          <w:pPr>
+            <w:tabs>
+              <w:tab w:val="right" w:leader="dot" w:pos="9720"/>
+            </w:tabs>
+            <w:spacing w:after="60" w:line="259" w:lineRule="auto"/>
+            <w:ind w:left="480"/>
+          </w:pPr>
+          <w:hyperlink w:anchor="_Toc725" w:history="1">
+            <w:r>
+              <w:rPr>
+                <w:sz w:val="20"/>
+                <w:szCs w:val="20"/>
+              </w:rPr>
+              <w:t xml:space="preserve">Role &amp; UserRoleAssignment (Vai trò &amp; Phân công vai trò)</w:t>
+            </w:r>
+            <w:r>
+              <w:tab/>
+            </w:r>
+            <w:r>
+              <w:fldChar w:fldCharType="begin"/>
+            </w:r>
+            <w:r>
+              <w:instrText xml:space="preserve"> PAGEREF _Toc725 \h </w:instrText>
+            </w:r>
+            <w:r>
+              <w:fldChar w:fldCharType="separate"/>
+            </w:r>
+            <w:r>
+              <w:rPr>
+                <w:sz w:val="20"/>
+                <w:szCs w:val="20"/>
+              </w:rPr>
+              <w:t xml:space="preserve">20</w:t>
+            </w:r>
+            <w:r>
+              <w:fldChar w:fldCharType="end"/>
+            </w:r>
+          </w:hyperlink>
+        </w:p>
+        <w:p>
+          <w:pPr>
+            <w:tabs>
+              <w:tab w:val="right" w:leader="dot" w:pos="9720"/>
+            </w:tabs>
+            <w:spacing w:after="60" w:line="259" w:lineRule="auto"/>
+            <w:ind w:left="480"/>
+          </w:pPr>
+          <w:hyperlink w:anchor="_Toc747" w:history="1">
+            <w:r>
+              <w:rPr>
+                <w:sz w:val="20"/>
+                <w:szCs w:val="20"/>
+              </w:rPr>
+              <w:t xml:space="preserve">HackathonEvent (Sự kiện)</w:t>
+            </w:r>
+            <w:r>
+              <w:tab/>
+            </w:r>
+            <w:r>
+              <w:fldChar w:fldCharType="begin"/>
+            </w:r>
+            <w:r>
+              <w:instrText xml:space="preserve"> PAGEREF _Toc747 \h </w:instrText>
+            </w:r>
+            <w:r>
+              <w:fldChar w:fldCharType="separate"/>
+            </w:r>
+            <w:r>
+              <w:rPr>
+                <w:sz w:val="20"/>
+                <w:szCs w:val="20"/>
+              </w:rPr>
+              <w:t xml:space="preserve">20</w:t>
+            </w:r>
+            <w:r>
+              <w:fldChar w:fldCharType="end"/>
+            </w:r>
+          </w:hyperlink>
+        </w:p>
+        <w:p>
+          <w:pPr>
+            <w:tabs>
+              <w:tab w:val="right" w:leader="dot" w:pos="9720"/>
+            </w:tabs>
+            <w:spacing w:after="60" w:line="259" w:lineRule="auto"/>
+            <w:ind w:left="480"/>
+          </w:pPr>
+          <w:hyperlink w:anchor="_Toc769" w:history="1">
+            <w:r>
+              <w:rPr>
+                <w:sz w:val="20"/>
+                <w:szCs w:val="20"/>
+              </w:rPr>
+              <w:t xml:space="preserve">Track (Hạng mục)</w:t>
+            </w:r>
+            <w:r>
+              <w:tab/>
+            </w:r>
+            <w:r>
+              <w:fldChar w:fldCharType="begin"/>
+            </w:r>
+            <w:r>
+              <w:instrText xml:space="preserve"> PAGEREF _Toc769 \h </w:instrText>
+            </w:r>
+            <w:r>
+              <w:fldChar w:fldCharType="separate"/>
+            </w:r>
+            <w:r>
+              <w:rPr>
+                <w:sz w:val="20"/>
+                <w:szCs w:val="20"/>
+              </w:rPr>
+              <w:t xml:space="preserve">21</w:t>
+            </w:r>
+            <w:r>
+              <w:fldChar w:fldCharType="end"/>
+            </w:r>
+          </w:hyperlink>
+        </w:p>
+        <w:p>
+          <w:pPr>
+            <w:tabs>
+              <w:tab w:val="right" w:leader="dot" w:pos="9720"/>
+            </w:tabs>
+            <w:spacing w:after="60" w:line="259" w:lineRule="auto"/>
+            <w:ind w:left="480"/>
+          </w:pPr>
+          <w:hyperlink w:anchor="_Toc788" w:history="1">
+            <w:r>
+              <w:rPr>
+                <w:sz w:val="20"/>
+                <w:szCs w:val="20"/>
+              </w:rPr>
+              <w:t xml:space="preserve">Round (Vòng thi)</w:t>
+            </w:r>
+            <w:r>
+              <w:tab/>
+            </w:r>
+            <w:r>
+              <w:fldChar w:fldCharType="begin"/>
+            </w:r>
+            <w:r>
+              <w:instrText xml:space="preserve"> PAGEREF _Toc788 \h </w:instrText>
+            </w:r>
+            <w:r>
+              <w:fldChar w:fldCharType="separate"/>
+            </w:r>
+            <w:r>
+              <w:rPr>
+                <w:sz w:val="20"/>
+                <w:szCs w:val="20"/>
+              </w:rPr>
+              <w:t xml:space="preserve">21</w:t>
+            </w:r>
+            <w:r>
+              <w:fldChar w:fldCharType="end"/>
+            </w:r>
+          </w:hyperlink>
+        </w:p>
+        <w:p>
+          <w:pPr>
+            <w:tabs>
+              <w:tab w:val="right" w:leader="dot" w:pos="9720"/>
+            </w:tabs>
+            <w:spacing w:after="60" w:line="259" w:lineRule="auto"/>
+            <w:ind w:left="480"/>
+          </w:pPr>
+          <w:hyperlink w:anchor="_Toc810" w:history="1">
+            <w:r>
+              <w:rPr>
+                <w:sz w:val="20"/>
+                <w:szCs w:val="20"/>
+              </w:rPr>
+              <w:t xml:space="preserve">CriteriaTemplate &amp; Criterion (Mẫu &amp; Tiêu chí chấm điểm)</w:t>
+            </w:r>
+            <w:r>
+              <w:tab/>
+            </w:r>
+            <w:r>
+              <w:fldChar w:fldCharType="begin"/>
+            </w:r>
+            <w:r>
+              <w:instrText xml:space="preserve"> PAGEREF _Toc810 \h </w:instrText>
+            </w:r>
+            <w:r>
+              <w:fldChar w:fldCharType="separate"/>
+            </w:r>
+            <w:r>
+              <w:rPr>
+                <w:sz w:val="20"/>
+                <w:szCs w:val="20"/>
+              </w:rPr>
+              <w:t xml:space="preserve">21</w:t>
+            </w:r>
+            <w:r>
+              <w:fldChar w:fldCharType="end"/>
+            </w:r>
+          </w:hyperlink>
+        </w:p>
+        <w:p>
+          <w:pPr>
+            <w:tabs>
+              <w:tab w:val="right" w:leader="dot" w:pos="9720"/>
+            </w:tabs>
+            <w:spacing w:after="60" w:line="259" w:lineRule="auto"/>
+            <w:ind w:left="480"/>
+          </w:pPr>
+          <w:hyperlink w:anchor="_Toc832" w:history="1">
+            <w:r>
+              <w:rPr>
+                <w:sz w:val="20"/>
+                <w:szCs w:val="20"/>
+              </w:rPr>
+              <w:t xml:space="preserve">Team &amp; TeamMember (Đội thi &amp; Thành viên)</w:t>
+            </w:r>
+            <w:r>
+              <w:tab/>
+            </w:r>
+            <w:r>
+              <w:fldChar w:fldCharType="begin"/>
+            </w:r>
+            <w:r>
+              <w:instrText xml:space="preserve"> PAGEREF _Toc832 \h </w:instrText>
+            </w:r>
+            <w:r>
+              <w:fldChar w:fldCharType="separate"/>
+            </w:r>
+            <w:r>
+              <w:rPr>
+                <w:sz w:val="20"/>
+                <w:szCs w:val="20"/>
+              </w:rPr>
+              <w:t xml:space="preserve">21</w:t>
+            </w:r>
+            <w:r>
+              <w:fldChar w:fldCharType="end"/>
+            </w:r>
+          </w:hyperlink>
+        </w:p>
+        <w:p>
+          <w:pPr>
+            <w:tabs>
+              <w:tab w:val="right" w:leader="dot" w:pos="9720"/>
+            </w:tabs>
+            <w:spacing w:after="60" w:line="259" w:lineRule="auto"/>
+            <w:ind w:left="480"/>
+          </w:pPr>
+          <w:hyperlink w:anchor="_Toc854" w:history="1">
+            <w:r>
+              <w:rPr>
+                <w:sz w:val="20"/>
+                <w:szCs w:val="20"/>
+              </w:rPr>
+              <w:t xml:space="preserve">Submission (Bài nộp)</w:t>
+            </w:r>
+            <w:r>
+              <w:tab/>
+            </w:r>
+            <w:r>
+              <w:fldChar w:fldCharType="begin"/>
+            </w:r>
+            <w:r>
+              <w:instrText xml:space="preserve"> PAGEREF _Toc854 \h </w:instrText>
+            </w:r>
+            <w:r>
+              <w:fldChar w:fldCharType="separate"/>
+            </w:r>
+            <w:r>
+              <w:rPr>
+                <w:sz w:val="20"/>
+                <w:szCs w:val="20"/>
+              </w:rPr>
+              <w:t xml:space="preserve">22</w:t>
+            </w:r>
+            <w:r>
+              <w:fldChar w:fldCharType="end"/>
+            </w:r>
+          </w:hyperlink>
+        </w:p>
+        <w:p>
+          <w:pPr>
+            <w:tabs>
+              <w:tab w:val="right" w:leader="dot" w:pos="9720"/>
+            </w:tabs>
+            <w:spacing w:after="60" w:line="259" w:lineRule="auto"/>
+            <w:ind w:left="480"/>
+          </w:pPr>
+          <w:hyperlink w:anchor="_Toc876" w:history="1">
+            <w:r>
+              <w:rPr>
+                <w:sz w:val="20"/>
+                <w:szCs w:val="20"/>
+              </w:rPr>
+              <w:t xml:space="preserve">Score (Điểm chấm — mức chi tiết nhất)</w:t>
+            </w:r>
+            <w:r>
+              <w:tab/>
+            </w:r>
+            <w:r>
+              <w:fldChar w:fldCharType="begin"/>
+            </w:r>
+            <w:r>
+              <w:instrText xml:space="preserve"> PAGEREF _Toc876 \h </w:instrText>
+            </w:r>
+            <w:r>
+              <w:fldChar w:fldCharType="separate"/>
+            </w:r>
+            <w:r>
+              <w:rPr>
+                <w:sz w:val="20"/>
+                <w:szCs w:val="20"/>
+              </w:rPr>
+              <w:t xml:space="preserve">22</w:t>
+            </w:r>
+            <w:r>
+              <w:fldChar w:fldCharType="end"/>
+            </w:r>
+          </w:hyperlink>
+        </w:p>
+        <w:p>
+          <w:pPr>
+            <w:tabs>
+              <w:tab w:val="right" w:leader="dot" w:pos="9720"/>
+            </w:tabs>
+            <w:spacing w:after="60" w:line="259" w:lineRule="auto"/>
+            <w:ind w:left="480"/>
+          </w:pPr>
+          <w:hyperlink w:anchor="_Toc898" w:history="1">
+            <w:r>
+              <w:rPr>
+                <w:sz w:val="20"/>
+                <w:szCs w:val="20"/>
+              </w:rPr>
+              <w:t xml:space="preserve">Ranking (Xếp hạng — dữ liệu tổng hợp)</w:t>
+            </w:r>
+            <w:r>
+              <w:tab/>
+            </w:r>
+            <w:r>
+              <w:fldChar w:fldCharType="begin"/>
+            </w:r>
+            <w:r>
+              <w:instrText xml:space="preserve"> PAGEREF _Toc898 \h </w:instrText>
+            </w:r>
+            <w:r>
+              <w:fldChar w:fldCharType="separate"/>
+            </w:r>
+            <w:r>
+              <w:rPr>
+                <w:sz w:val="20"/>
+                <w:szCs w:val="20"/>
+              </w:rPr>
+              <w:t xml:space="preserve">22</w:t>
+            </w:r>
+            <w:r>
+              <w:fldChar w:fldCharType="end"/>
+            </w:r>
+          </w:hyperlink>
+        </w:p>
+        <w:p>
+          <w:pPr>
+            <w:tabs>
+              <w:tab w:val="right" w:leader="dot" w:pos="9720"/>
+            </w:tabs>
+            <w:spacing w:after="60" w:line="259" w:lineRule="auto"/>
+            <w:ind w:left="480"/>
+          </w:pPr>
+          <w:hyperlink w:anchor="_Toc917" w:history="1">
+            <w:r>
+              <w:rPr>
+                <w:sz w:val="20"/>
+                <w:szCs w:val="20"/>
+              </w:rPr>
+              <w:t xml:space="preserve">Disqualification (Loại đội/bài nộp) &amp; AuditLog</w:t>
+            </w:r>
+            <w:r>
+              <w:tab/>
+            </w:r>
+            <w:r>
+              <w:fldChar w:fldCharType="begin"/>
+            </w:r>
+            <w:r>
+              <w:instrText xml:space="preserve"> PAGEREF _Toc917 \h </w:instrText>
+            </w:r>
+            <w:r>
+              <w:fldChar w:fldCharType="separate"/>
+            </w:r>
+            <w:r>
+              <w:rPr>
+                <w:sz w:val="20"/>
+                <w:szCs w:val="20"/>
+              </w:rPr>
+              <w:t xml:space="preserve">22</w:t>
+            </w:r>
+            <w:r>
+              <w:fldChar w:fldCharType="end"/>
+            </w:r>
+          </w:hyperlink>
+        </w:p>
+        <w:p>
+          <w:pPr>
+            <w:tabs>
+              <w:tab w:val="right" w:leader="dot" w:pos="9720"/>
+            </w:tabs>
+            <w:spacing w:after="60" w:line="259" w:lineRule="auto"/>
+            <w:ind w:left="480"/>
+          </w:pPr>
+          <w:hyperlink w:anchor="_Toc942" w:history="1">
+            <w:r>
+              <w:rPr>
+                <w:sz w:val="20"/>
+                <w:szCs w:val="20"/>
+              </w:rPr>
+              <w:t xml:space="preserve">Prize (Giải thưởng)</w:t>
+            </w:r>
+            <w:r>
+              <w:tab/>
+            </w:r>
+            <w:r>
+              <w:fldChar w:fldCharType="begin"/>
+            </w:r>
+            <w:r>
+              <w:instrText xml:space="preserve"> PAGEREF _Toc942 \h </w:instrText>
+            </w:r>
+            <w:r>
+              <w:fldChar w:fldCharType="separate"/>
+            </w:r>
+            <w:r>
+              <w:rPr>
+                <w:sz w:val="20"/>
+                <w:szCs w:val="20"/>
+              </w:rPr>
+              <w:t xml:space="preserve">23</w:t>
+            </w:r>
+            <w:r>
+              <w:fldChar w:fldCharType="end"/>
+            </w:r>
+          </w:hyperlink>
+        </w:p>
+        <w:p>
+          <w:pPr>
+            <w:tabs>
+              <w:tab w:val="right" w:leader="dot" w:pos="9720"/>
+            </w:tabs>
+            <w:spacing w:after="60" w:line="259" w:lineRule="auto"/>
+            <w:ind w:left="480"/>
+          </w:pPr>
+          <w:hyperlink w:anchor="_Toc961" w:history="1">
+            <w:r>
+              <w:rPr>
+                <w:sz w:val="20"/>
+                <w:szCs w:val="20"/>
+              </w:rPr>
+              <w:t xml:space="preserve">CalibrationRound &amp; CalibrationScore (phục vụ RBL)</w:t>
+            </w:r>
+            <w:r>
+              <w:tab/>
+            </w:r>
+            <w:r>
+              <w:fldChar w:fldCharType="begin"/>
+            </w:r>
+            <w:r>
+              <w:instrText xml:space="preserve"> PAGEREF _Toc961 \h </w:instrText>
+            </w:r>
+            <w:r>
+              <w:fldChar w:fldCharType="separate"/>
+            </w:r>
+            <w:r>
+              <w:rPr>
+                <w:sz w:val="20"/>
+                <w:szCs w:val="20"/>
+              </w:rPr>
+              <w:t xml:space="preserve">23</w:t>
+            </w:r>
+            <w:r>
+              <w:fldChar w:fldCharType="end"/>
+            </w:r>
+          </w:hyperlink>
+        </w:p>
+        <w:p>
+          <w:pPr>
+            <w:tabs>
+              <w:tab w:val="right" w:leader="dot" w:pos="9720"/>
+            </w:tabs>
+            <w:spacing w:after="60" w:line="259" w:lineRule="auto"/>
+            <w:ind w:left="240"/>
+          </w:pPr>
+          <w:hyperlink w:anchor="_Toc974" w:history="1">
+            <w:r>
+              <w:rPr>
+                <w:sz w:val="21"/>
+                <w:szCs w:val="21"/>
+              </w:rPr>
+              <w:t xml:space="preserve">6.2. Quan hệ giữa các thực thể (tóm tắt)</w:t>
+            </w:r>
+            <w:r>
+              <w:tab/>
+            </w:r>
+            <w:r>
+              <w:fldChar w:fldCharType="begin"/>
+            </w:r>
+            <w:r>
+              <w:instrText xml:space="preserve"> PAGEREF _Toc974 \h </w:instrText>
+            </w:r>
+            <w:r>
+              <w:fldChar w:fldCharType="separate"/>
+            </w:r>
+            <w:r>
+              <w:rPr>
+                <w:sz w:val="21"/>
+                <w:szCs w:val="21"/>
+              </w:rPr>
+              <w:t xml:space="preserve">23</w:t>
+            </w:r>
+            <w:r>
+              <w:fldChar w:fldCharType="end"/>
+            </w:r>
+          </w:hyperlink>
+        </w:p>
+        <w:p>
+          <w:pPr>
+            <w:tabs>
+              <w:tab w:val="right" w:leader="dot" w:pos="9720"/>
+            </w:tabs>
+            <w:spacing w:after="60" w:line="259" w:lineRule="auto"/>
+            <w:ind w:left="0"/>
+          </w:pPr>
+          <w:hyperlink w:anchor="_Toc1003" w:history="1">
+            <w:r>
+              <w:rPr>
+                <w:b/>
+                <w:bCs/>
+                <w:sz w:val="22"/>
+                <w:szCs w:val="22"/>
+              </w:rPr>
+              <w:t xml:space="preserve">7. KIẾN TRÚC HỆ THỐNG ĐỀ XUẤT</w:t>
+            </w:r>
+            <w:r>
+              <w:tab/>
+            </w:r>
+            <w:r>
+              <w:fldChar w:fldCharType="begin"/>
+            </w:r>
+            <w:r>
+              <w:instrText xml:space="preserve"> PAGEREF _Toc1003 \h </w:instrText>
+            </w:r>
+            <w:r>
+              <w:fldChar w:fldCharType="separate"/>
+            </w:r>
+            <w:r>
+              <w:rPr>
+                <w:sz w:val="22"/>
+                <w:szCs w:val="22"/>
+              </w:rPr>
+              <w:t xml:space="preserve">25</w:t>
+            </w:r>
+            <w:r>
+              <w:fldChar w:fldCharType="end"/>
+            </w:r>
+          </w:hyperlink>
+        </w:p>
+        <w:p>
+          <w:pPr>
+            <w:tabs>
+              <w:tab w:val="right" w:leader="dot" w:pos="9720"/>
+            </w:tabs>
+            <w:spacing w:after="60" w:line="259" w:lineRule="auto"/>
+            <w:ind w:left="240"/>
+          </w:pPr>
+          <w:hyperlink w:anchor="_Toc1004" w:history="1">
+            <w:r>
+              <w:rPr>
+                <w:sz w:val="21"/>
+                <w:szCs w:val="21"/>
+              </w:rPr>
+              <w:t xml:space="preserve">7.1. Kiến trúc tổng quan</w:t>
+            </w:r>
+            <w:r>
+              <w:tab/>
+            </w:r>
+            <w:r>
+              <w:fldChar w:fldCharType="begin"/>
+            </w:r>
+            <w:r>
+              <w:instrText xml:space="preserve"> PAGEREF _Toc1004 \h </w:instrText>
+            </w:r>
+            <w:r>
+              <w:fldChar w:fldCharType="separate"/>
+            </w:r>
+            <w:r>
+              <w:rPr>
+                <w:sz w:val="21"/>
+                <w:szCs w:val="21"/>
+              </w:rPr>
+              <w:t xml:space="preserve">25</w:t>
+            </w:r>
+            <w:r>
+              <w:fldChar w:fldCharType="end"/>
+            </w:r>
+          </w:hyperlink>
+        </w:p>
+        <w:p>
+          <w:pPr>
+            <w:tabs>
+              <w:tab w:val="right" w:leader="dot" w:pos="9720"/>
+            </w:tabs>
+            <w:spacing w:after="60" w:line="259" w:lineRule="auto"/>
+            <w:ind w:left="240"/>
+          </w:pPr>
+          <w:hyperlink w:anchor="_Toc1009" w:history="1">
+            <w:r>
+              <w:rPr>
+                <w:sz w:val="21"/>
+                <w:szCs w:val="21"/>
+              </w:rPr>
+              <w:t xml:space="preserve">7.2. Công nghệ đề xuất</w:t>
+            </w:r>
+            <w:r>
+              <w:tab/>
+            </w:r>
+            <w:r>
+              <w:fldChar w:fldCharType="begin"/>
+            </w:r>
+            <w:r>
+              <w:instrText xml:space="preserve"> PAGEREF _Toc1009 \h </w:instrText>
+            </w:r>
+            <w:r>
+              <w:fldChar w:fldCharType="separate"/>
+            </w:r>
+            <w:r>
+              <w:rPr>
+                <w:sz w:val="21"/>
+                <w:szCs w:val="21"/>
+              </w:rPr>
+              <w:t xml:space="preserve">25</w:t>
+            </w:r>
+            <w:r>
+              <w:fldChar w:fldCharType="end"/>
+            </w:r>
+          </w:hyperlink>
+        </w:p>
+        <w:p>
+          <w:pPr>
+            <w:tabs>
+              <w:tab w:val="right" w:leader="dot" w:pos="9720"/>
+            </w:tabs>
+            <w:spacing w:after="60" w:line="259" w:lineRule="auto"/>
+            <w:ind w:left="240"/>
+          </w:pPr>
+          <w:hyperlink w:anchor="_Toc1034" w:history="1">
+            <w:r>
+              <w:rPr>
+                <w:sz w:val="21"/>
+                <w:szCs w:val="21"/>
+              </w:rPr>
+              <w:t xml:space="preserve">7.3. Luồng nghiệp vụ tổng quát</w:t>
+            </w:r>
+            <w:r>
+              <w:tab/>
+            </w:r>
+            <w:r>
+              <w:fldChar w:fldCharType="begin"/>
+            </w:r>
+            <w:r>
+              <w:instrText xml:space="preserve"> PAGEREF _Toc1034 \h </w:instrText>
+            </w:r>
+            <w:r>
+              <w:fldChar w:fldCharType="separate"/>
+            </w:r>
+            <w:r>
+              <w:rPr>
+                <w:sz w:val="21"/>
+                <w:szCs w:val="21"/>
+              </w:rPr>
+              <w:t xml:space="preserve">25</w:t>
+            </w:r>
+            <w:r>
+              <w:fldChar w:fldCharType="end"/>
+            </w:r>
+          </w:hyperlink>
+        </w:p>
+        <w:p>
+          <w:pPr>
+            <w:tabs>
+              <w:tab w:val="right" w:leader="dot" w:pos="9720"/>
+            </w:tabs>
+            <w:spacing w:after="60" w:line="259" w:lineRule="auto"/>
+            <w:ind w:left="0"/>
+          </w:pPr>
+          <w:hyperlink w:anchor="_Toc1037" w:history="1">
+            <w:r>
+              <w:rPr>
+                <w:b/>
+                <w:bCs/>
+                <w:sz w:val="22"/>
+                <w:szCs w:val="22"/>
+              </w:rPr>
+              <w:t xml:space="preserve">8. THÀNH PHẦN NGHIÊN CỨU (RESEARCH-BASED LEARNING)</w:t>
+            </w:r>
+            <w:r>
+              <w:tab/>
+            </w:r>
+            <w:r>
+              <w:fldChar w:fldCharType="begin"/>
+            </w:r>
+            <w:r>
+              <w:instrText xml:space="preserve"> PAGEREF _Toc1037 \h </w:instrText>
+            </w:r>
+            <w:r>
+              <w:fldChar w:fldCharType="separate"/>
+            </w:r>
+            <w:r>
+              <w:rPr>
+                <w:sz w:val="22"/>
+                <w:szCs w:val="22"/>
+              </w:rPr>
+              <w:t xml:space="preserve">26</w:t>
+            </w:r>
+            <w:r>
+              <w:fldChar w:fldCharType="end"/>
+            </w:r>
+          </w:hyperlink>
+        </w:p>
+        <w:p>
+          <w:pPr>
+            <w:tabs>
+              <w:tab w:val="right" w:leader="dot" w:pos="9720"/>
+            </w:tabs>
+            <w:spacing w:after="60" w:line="259" w:lineRule="auto"/>
+            <w:ind w:left="240"/>
+          </w:pPr>
+          <w:hyperlink w:anchor="_Toc1038" w:history="1">
+            <w:r>
+              <w:rPr>
+                <w:sz w:val="21"/>
+                <w:szCs w:val="21"/>
+              </w:rPr>
+              <w:t xml:space="preserve">8.1. Câu hỏi nghiên cứu</w:t>
+            </w:r>
+            <w:r>
+              <w:tab/>
+            </w:r>
+            <w:r>
+              <w:fldChar w:fldCharType="begin"/>
+            </w:r>
+            <w:r>
+              <w:instrText xml:space="preserve"> PAGEREF _Toc1038 \h </w:instrText>
+            </w:r>
+            <w:r>
+              <w:fldChar w:fldCharType="separate"/>
+            </w:r>
+            <w:r>
+              <w:rPr>
+                <w:sz w:val="21"/>
+                <w:szCs w:val="21"/>
+              </w:rPr>
+              <w:t xml:space="preserve">26</w:t>
+            </w:r>
+            <w:r>
+              <w:fldChar w:fldCharType="end"/>
+            </w:r>
+          </w:hyperlink>
+        </w:p>
+        <w:p>
+          <w:pPr>
+            <w:tabs>
+              <w:tab w:val="right" w:leader="dot" w:pos="9720"/>
+            </w:tabs>
+            <w:spacing w:after="60" w:line="259" w:lineRule="auto"/>
+            <w:ind w:left="240"/>
+          </w:pPr>
+          <w:hyperlink w:anchor="_Toc1043" w:history="1">
+            <w:r>
+              <w:rPr>
+                <w:sz w:val="21"/>
+                <w:szCs w:val="21"/>
+              </w:rPr>
+              <w:t xml:space="preserve">8.2. Phương pháp thu thập dữ liệu</w:t>
+            </w:r>
+            <w:r>
+              <w:tab/>
+            </w:r>
+            <w:r>
+              <w:fldChar w:fldCharType="begin"/>
+            </w:r>
+            <w:r>
+              <w:instrText xml:space="preserve"> PAGEREF _Toc1043 \h </w:instrText>
+            </w:r>
+            <w:r>
+              <w:fldChar w:fldCharType="separate"/>
+            </w:r>
+            <w:r>
+              <w:rPr>
+                <w:sz w:val="21"/>
+                <w:szCs w:val="21"/>
+              </w:rPr>
+              <w:t xml:space="preserve">26</w:t>
+            </w:r>
+            <w:r>
+              <w:fldChar w:fldCharType="end"/>
+            </w:r>
+          </w:hyperlink>
+        </w:p>
+        <w:p>
+          <w:pPr>
+            <w:tabs>
+              <w:tab w:val="right" w:leader="dot" w:pos="9720"/>
+            </w:tabs>
+            <w:spacing w:after="60" w:line="259" w:lineRule="auto"/>
+            <w:ind w:left="240"/>
+          </w:pPr>
+          <w:hyperlink w:anchor="_Toc1049" w:history="1">
+            <w:r>
+              <w:rPr>
+                <w:sz w:val="21"/>
+                <w:szCs w:val="21"/>
+              </w:rPr>
+              <w:t xml:space="preserve">8.3. Phương pháp phân tích thống kê</w:t>
+            </w:r>
+            <w:r>
+              <w:tab/>
+            </w:r>
+            <w:r>
+              <w:fldChar w:fldCharType="begin"/>
+            </w:r>
+            <w:r>
+              <w:instrText xml:space="preserve"> PAGEREF _Toc1049 \h </w:instrText>
+            </w:r>
+            <w:r>
+              <w:fldChar w:fldCharType="separate"/>
+            </w:r>
+            <w:r>
+              <w:rPr>
+                <w:sz w:val="21"/>
+                <w:szCs w:val="21"/>
+              </w:rPr>
+              <w:t xml:space="preserve">26</w:t>
+            </w:r>
+            <w:r>
+              <w:fldChar w:fldCharType="end"/>
+            </w:r>
+          </w:hyperlink>
+        </w:p>
+        <w:p>
+          <w:pPr>
+            <w:tabs>
+              <w:tab w:val="right" w:leader="dot" w:pos="9720"/>
+            </w:tabs>
+            <w:spacing w:after="60" w:line="259" w:lineRule="auto"/>
+            <w:ind w:left="240"/>
+          </w:pPr>
+          <w:hyperlink w:anchor="_Toc1065" w:history="1">
+            <w:r>
+              <w:rPr>
+                <w:sz w:val="21"/>
+                <w:szCs w:val="21"/>
+              </w:rPr>
+              <w:t xml:space="preserve">8.4. Thiết kế hệ thống hỗ trợ nghiên cứu</w:t>
+            </w:r>
+            <w:r>
+              <w:tab/>
+            </w:r>
+            <w:r>
+              <w:fldChar w:fldCharType="begin"/>
+            </w:r>
+            <w:r>
+              <w:instrText xml:space="preserve"> PAGEREF _Toc1065 \h </w:instrText>
+            </w:r>
+            <w:r>
+              <w:fldChar w:fldCharType="separate"/>
+            </w:r>
+            <w:r>
+              <w:rPr>
+                <w:sz w:val="21"/>
+                <w:szCs w:val="21"/>
+              </w:rPr>
+              <w:t xml:space="preserve">27</w:t>
+            </w:r>
+            <w:r>
+              <w:fldChar w:fldCharType="end"/>
+            </w:r>
+          </w:hyperlink>
+        </w:p>
+        <w:p>
+          <w:pPr>
+            <w:tabs>
+              <w:tab w:val="right" w:leader="dot" w:pos="9720"/>
+            </w:tabs>
+            <w:spacing w:after="60" w:line="259" w:lineRule="auto"/>
+            <w:ind w:left="240"/>
+          </w:pPr>
+          <w:hyperlink w:anchor="_Toc1070" w:history="1">
+            <w:r>
+              <w:rPr>
+                <w:sz w:val="21"/>
+                <w:szCs w:val="21"/>
+              </w:rPr>
+              <w:t xml:space="preserve">8.5. Đạo đức nghiên cứu và ẩn danh dữ liệu</w:t>
+            </w:r>
+            <w:r>
+              <w:tab/>
+            </w:r>
+            <w:r>
+              <w:fldChar w:fldCharType="begin"/>
+            </w:r>
+            <w:r>
+              <w:instrText xml:space="preserve"> PAGEREF _Toc1070 \h </w:instrText>
+            </w:r>
+            <w:r>
+              <w:fldChar w:fldCharType="separate"/>
+            </w:r>
+            <w:r>
+              <w:rPr>
+                <w:sz w:val="21"/>
+                <w:szCs w:val="21"/>
+              </w:rPr>
+              <w:t xml:space="preserve">27</w:t>
+            </w:r>
+            <w:r>
+              <w:fldChar w:fldCharType="end"/>
+            </w:r>
+          </w:hyperlink>
+        </w:p>
+        <w:p>
+          <w:pPr>
+            <w:tabs>
+              <w:tab w:val="right" w:leader="dot" w:pos="9720"/>
+            </w:tabs>
+            <w:spacing w:after="60" w:line="259" w:lineRule="auto"/>
+            <w:ind w:left="0"/>
+          </w:pPr>
+          <w:hyperlink w:anchor="_Toc1075" w:history="1">
+            <w:r>
+              <w:rPr>
+                <w:b/>
+                <w:bCs/>
+                <w:sz w:val="22"/>
+                <w:szCs w:val="22"/>
+              </w:rPr>
+              <w:t xml:space="preserve">9. LỘ TRÌNH TRIỂN KHAI ĐỀ XUẤT</w:t>
+            </w:r>
+            <w:r>
+              <w:tab/>
+            </w:r>
+            <w:r>
+              <w:fldChar w:fldCharType="begin"/>
+            </w:r>
+            <w:r>
+              <w:instrText xml:space="preserve"> PAGEREF _Toc1075 \h </w:instrText>
+            </w:r>
+            <w:r>
+              <w:fldChar w:fldCharType="separate"/>
+            </w:r>
+            <w:r>
+              <w:rPr>
+                <w:sz w:val="22"/>
+                <w:szCs w:val="22"/>
+              </w:rPr>
+              <w:t xml:space="preserve">28</w:t>
+            </w:r>
+            <w:r>
+              <w:fldChar w:fldCharType="end"/>
+            </w:r>
+          </w:hyperlink>
+        </w:p>
+        <w:p>
+          <w:pPr>
+            <w:tabs>
+              <w:tab w:val="right" w:leader="dot" w:pos="9720"/>
+            </w:tabs>
+            <w:spacing w:after="60" w:line="259" w:lineRule="auto"/>
+            <w:ind w:left="0"/>
+          </w:pPr>
+          <w:hyperlink w:anchor="_Toc1096" w:history="1">
+            <w:r>
+              <w:rPr>
+                <w:b/>
+                <w:bCs/>
+                <w:sz w:val="22"/>
+                <w:szCs w:val="22"/>
+              </w:rPr>
+              <w:t xml:space="preserve">10. TIÊU CHÍ NGHIỆM THU (DEFINITION OF DONE)</w:t>
+            </w:r>
+            <w:r>
+              <w:tab/>
+            </w:r>
+            <w:r>
+              <w:fldChar w:fldCharType="begin"/>
+            </w:r>
+            <w:r>
+              <w:instrText xml:space="preserve"> PAGEREF _Toc1096 \h </w:instrText>
+            </w:r>
+            <w:r>
+              <w:fldChar w:fldCharType="separate"/>
+            </w:r>
+            <w:r>
+              <w:rPr>
+                <w:sz w:val="22"/>
+                <w:szCs w:val="22"/>
+              </w:rPr>
+              <w:t xml:space="preserve">29</w:t>
+            </w:r>
+            <w:r>
+              <w:fldChar w:fldCharType="end"/>
+            </w:r>
+          </w:hyperlink>
+        </w:p>
+        <w:p>
+          <w:pPr>
+            <w:tabs>
+              <w:tab w:val="right" w:leader="dot" w:pos="9720"/>
+            </w:tabs>
+            <w:spacing w:after="60" w:line="259" w:lineRule="auto"/>
+            <w:ind w:left="0"/>
+          </w:pPr>
+          <w:hyperlink w:anchor="_Toc1105" w:history="1">
+            <w:r>
+              <w:rPr>
+                <w:b/>
+                <w:bCs/>
+                <w:sz w:val="22"/>
+                <w:szCs w:val="22"/>
+              </w:rPr>
+              <w:t xml:space="preserve">11. RỦI RO VÀ BIỆN PHÁP GIẢM THIỂU</w:t>
+            </w:r>
+            <w:r>
+              <w:tab/>
+            </w:r>
+            <w:r>
+              <w:fldChar w:fldCharType="begin"/>
+            </w:r>
+            <w:r>
+              <w:instrText xml:space="preserve"> PAGEREF _Toc1105 \h </w:instrText>
+            </w:r>
+            <w:r>
+              <w:fldChar w:fldCharType="separate"/>
+            </w:r>
+            <w:r>
+              <w:rPr>
+                <w:sz w:val="22"/>
+                <w:szCs w:val="22"/>
+              </w:rPr>
+              <w:t xml:space="preserve">30</w:t>
+            </w:r>
+            <w:r>
+              <w:fldChar w:fldCharType="end"/>
+            </w:r>
+          </w:hyperlink>
+        </w:p>
+        <w:p>
+          <w:pPr>
+            <w:tabs>
+              <w:tab w:val="right" w:leader="dot" w:pos="9720"/>
+            </w:tabs>
+            <w:spacing w:after="60" w:line="259" w:lineRule="auto"/>
+            <w:ind w:left="0"/>
+          </w:pPr>
+          <w:hyperlink w:anchor="_Toc1125" w:history="1">
+            <w:r>
+              <w:rPr>
+                <w:b/>
+                <w:bCs/>
+                <w:sz w:val="22"/>
+                <w:szCs w:val="22"/>
+              </w:rPr>
+              <w:t xml:space="preserve">12. KẾT LUẬN</w:t>
+            </w:r>
+            <w:r>
+              <w:tab/>
+            </w:r>
+            <w:r>
+              <w:fldChar w:fldCharType="begin"/>
+            </w:r>
+            <w:r>
+              <w:instrText xml:space="preserve"> PAGEREF _Toc1125 \h </w:instrText>
+            </w:r>
+            <w:r>
+              <w:fldChar w:fldCharType="separate"/>
+            </w:r>
+            <w:r>
+              <w:rPr>
+                <w:sz w:val="22"/>
+                <w:szCs w:val="22"/>
+              </w:rPr>
+              <w:t xml:space="preserve">31</w:t>
+            </w:r>
+            <w:r>
+              <w:fldChar w:fldCharType="end"/>
+            </w:r>
+          </w:hyperlink>
+        </w:p>
+        <w:p>
           <w:r>
             <w:fldChar w:fldCharType="end"/>
           </w:r>
@@ -492,6 +3996,7 @@
         <w:pStyle w:val="Heading1"/>
         <w:spacing w:after="200" w:before="360"/>
       </w:pPr>
+      <w:bookmarkStart w:id="1" w:name="_Toc26"/>
       <w:r>
         <w:rPr>
           <w:b/>
@@ -502,12 +4007,14 @@
         </w:rPr>
         <w:t xml:space="preserve">1. GIỚI THIỆU</w:t>
       </w:r>
+      <w:bookmarkEnd w:id="1"/>
     </w:p>
     <w:p>
       <w:pPr>
         <w:pStyle w:val="Heading2"/>
         <w:spacing w:after="140" w:before="260"/>
       </w:pPr>
+      <w:bookmarkStart w:id="2" w:name="_Toc27"/>
       <w:r>
         <w:rPr>
           <w:b/>
@@ -518,6 +4025,7 @@
         </w:rPr>
         <w:t xml:space="preserve">1.1. Mục đích tài liệu</w:t>
       </w:r>
+      <w:bookmarkEnd w:id="2"/>
     </w:p>
     <w:p>
       <w:pPr>
@@ -537,6 +4045,7 @@
         <w:pStyle w:val="Heading2"/>
         <w:spacing w:after="140" w:before="260"/>
       </w:pPr>
+      <w:bookmarkStart w:id="3" w:name="_Toc29"/>
       <w:r>
         <w:rPr>
           <w:b/>
@@ -547,6 +4056,7 @@
         </w:rPr>
         <w:t xml:space="preserve">1.2. Phạm vi dự án</w:t>
       </w:r>
+      <w:bookmarkEnd w:id="3"/>
     </w:p>
     <w:p>
       <w:pPr>
@@ -566,6 +4076,7 @@
         <w:pStyle w:val="Heading2"/>
         <w:spacing w:after="140" w:before="260"/>
       </w:pPr>
+      <w:bookmarkStart w:id="4" w:name="_Toc31"/>
       <w:r>
         <w:rPr>
           <w:b/>
@@ -576,6 +4087,7 @@
         </w:rPr>
         <w:t xml:space="preserve">1.3. Bối cảnh và vấn đề hiện tại</w:t>
       </w:r>
+      <w:bookmarkEnd w:id="4"/>
     </w:p>
     <w:p>
       <w:pPr>
@@ -680,6 +4192,7 @@
         <w:pStyle w:val="Heading2"/>
         <w:spacing w:after="140" w:before="260"/>
       </w:pPr>
+      <w:bookmarkStart w:id="5" w:name="_Toc38"/>
       <w:r>
         <w:rPr>
           <w:b/>
@@ -690,6 +4203,7 @@
         </w:rPr>
         <w:t xml:space="preserve">1.4. Mục tiêu dự án</w:t>
       </w:r>
+      <w:bookmarkEnd w:id="5"/>
     </w:p>
     <w:p>
       <w:pPr>
@@ -764,6 +4278,7 @@
         <w:pStyle w:val="Heading2"/>
         <w:spacing w:after="140" w:before="260"/>
       </w:pPr>
+      <w:bookmarkStart w:id="6" w:name="_Toc43"/>
       <w:r>
         <w:rPr>
           <w:b/>
@@ -774,6 +4289,7 @@
         </w:rPr>
         <w:t xml:space="preserve">1.5. Định nghĩa, thuật ngữ và từ viết tắt</w:t>
       </w:r>
+      <w:bookmarkEnd w:id="6"/>
     </w:p>
     <w:tbl>
       <w:tblPr>
@@ -1628,6 +5144,7 @@
         <w:pStyle w:val="Heading2"/>
         <w:spacing w:after="140" w:before="260"/>
       </w:pPr>
+      <w:bookmarkStart w:id="7" w:name="_Toc74"/>
       <w:r>
         <w:rPr>
           <w:b/>
@@ -1638,6 +5155,7 @@
         </w:rPr>
         <w:t xml:space="preserve">1.6. Tài liệu tham khảo</w:t>
       </w:r>
+      <w:bookmarkEnd w:id="7"/>
     </w:p>
     <w:p>
       <w:pPr>
@@ -1700,6 +5218,7 @@
         <w:pStyle w:val="Heading1"/>
         <w:spacing w:after="200" w:before="360"/>
       </w:pPr>
+      <w:bookmarkStart w:id="8" w:name="_Toc79"/>
       <w:r>
         <w:rPr>
           <w:b/>
@@ -1710,12 +5229,14 @@
         </w:rPr>
         <w:t xml:space="preserve">2. TỔNG QUAN HỆ THỐNG VÀ VAI TRÒ NGHIỆP VỤ</w:t>
       </w:r>
+      <w:bookmarkEnd w:id="8"/>
     </w:p>
     <w:p>
       <w:pPr>
         <w:pStyle w:val="Heading2"/>
         <w:spacing w:after="140" w:before="260"/>
       </w:pPr>
+      <w:bookmarkStart w:id="9" w:name="_Toc80"/>
       <w:r>
         <w:rPr>
           <w:b/>
@@ -1726,6 +5247,7 @@
         </w:rPr>
         <w:t xml:space="preserve">2.1. Đối tượng người dùng (Business Roles / Actors)</w:t>
       </w:r>
+      <w:bookmarkEnd w:id="9"/>
     </w:p>
     <w:p>
       <w:pPr>
@@ -2262,6 +5784,7 @@
         <w:pStyle w:val="Heading2"/>
         <w:spacing w:after="140" w:before="260"/>
       </w:pPr>
+      <w:bookmarkStart w:id="10" w:name="_Toc100"/>
       <w:r>
         <w:rPr>
           <w:b/>
@@ -2272,6 +5795,7 @@
         </w:rPr>
         <w:t xml:space="preserve">2.2. Ràng buộc nghiệp vụ quan trọng</w:t>
       </w:r>
+      <w:bookmarkEnd w:id="10"/>
     </w:p>
     <w:p>
       <w:pPr>
@@ -2368,6 +5892,7 @@
         <w:pStyle w:val="Heading1"/>
         <w:spacing w:after="200" w:before="360"/>
       </w:pPr>
+      <w:bookmarkStart w:id="11" w:name="_Toc107"/>
       <w:r>
         <w:rPr>
           <w:b/>
@@ -2378,6 +5903,7 @@
         </w:rPr>
         <w:t xml:space="preserve">3. YÊU CẦU CHỨC NĂNG</w:t>
       </w:r>
+      <w:bookmarkEnd w:id="11"/>
     </w:p>
     <w:p>
       <w:pPr>
@@ -2397,6 +5923,7 @@
         <w:pStyle w:val="Heading2"/>
         <w:spacing w:after="140" w:before="260"/>
       </w:pPr>
+      <w:bookmarkStart w:id="12" w:name="_Toc109"/>
       <w:r>
         <w:rPr>
           <w:b/>
@@ -2407,12 +5934,14 @@
         </w:rPr>
         <w:t xml:space="preserve">3.1. Mô-đun Đăng ký &amp; Xác thực người dùng</w:t>
       </w:r>
+      <w:bookmarkEnd w:id="12"/>
     </w:p>
     <w:p>
       <w:pPr>
         <w:pStyle w:val="Heading3"/>
         <w:spacing w:after="100" w:before="200"/>
       </w:pPr>
+      <w:bookmarkStart w:id="13" w:name="_Toc110"/>
       <w:r>
         <w:rPr>
           <w:b/>
@@ -2424,6 +5953,7 @@
         </w:rPr>
         <w:t xml:space="preserve">UC-01 — Đăng ký tài khoản</w:t>
       </w:r>
+      <w:bookmarkEnd w:id="13"/>
     </w:p>
     <w:tbl>
       <w:tblPr>
@@ -2843,6 +6373,7 @@
         <w:pStyle w:val="Heading3"/>
         <w:spacing w:after="100" w:before="200"/>
       </w:pPr>
+      <w:bookmarkStart w:id="14" w:name="_Toc126"/>
       <w:r>
         <w:rPr>
           <w:b/>
@@ -2854,6 +6385,7 @@
         </w:rPr>
         <w:t xml:space="preserve">UC-02 — Phê duyệt tài khoản</w:t>
       </w:r>
+      <w:bookmarkEnd w:id="14"/>
     </w:p>
     <w:tbl>
       <w:tblPr>
@@ -3273,6 +6805,7 @@
         <w:pStyle w:val="Heading3"/>
         <w:spacing w:after="100" w:before="200"/>
       </w:pPr>
+      <w:bookmarkStart w:id="15" w:name="_Toc142"/>
       <w:r>
         <w:rPr>
           <w:b/>
@@ -3284,6 +6817,7 @@
         </w:rPr>
         <w:t xml:space="preserve">UC-03 — Đăng nhập (JWT)</w:t>
       </w:r>
+      <w:bookmarkEnd w:id="15"/>
     </w:p>
     <w:tbl>
       <w:tblPr>
@@ -3703,6 +7237,7 @@
         <w:pStyle w:val="Heading3"/>
         <w:spacing w:after="100" w:before="200"/>
       </w:pPr>
+      <w:bookmarkStart w:id="16" w:name="_Toc158"/>
       <w:r>
         <w:rPr>
           <w:b/>
@@ -3714,6 +7249,7 @@
         </w:rPr>
         <w:t xml:space="preserve">UC-04 — Khởi tạo tài khoản Giám khảo khách mời</w:t>
       </w:r>
+      <w:bookmarkEnd w:id="16"/>
     </w:p>
     <w:tbl>
       <w:tblPr>
@@ -4133,6 +7669,7 @@
         <w:pStyle w:val="Heading2"/>
         <w:spacing w:after="140" w:before="260"/>
       </w:pPr>
+      <w:bookmarkStart w:id="17" w:name="_Toc174"/>
       <w:r>
         <w:rPr>
           <w:b/>
@@ -4143,12 +7680,14 @@
         </w:rPr>
         <w:t xml:space="preserve">3.2. Mô-đun Quản lý sự kiện &amp; vòng thi</w:t>
       </w:r>
+      <w:bookmarkEnd w:id="17"/>
     </w:p>
     <w:p>
       <w:pPr>
         <w:pStyle w:val="Heading3"/>
         <w:spacing w:after="100" w:before="200"/>
       </w:pPr>
+      <w:bookmarkStart w:id="18" w:name="_Toc175"/>
       <w:r>
         <w:rPr>
           <w:b/>
@@ -4160,6 +7699,7 @@
         </w:rPr>
         <w:t xml:space="preserve">UC-05 — Tạo và quản lý sự kiện Hackathon</w:t>
       </w:r>
+      <w:bookmarkEnd w:id="18"/>
     </w:p>
     <w:tbl>
       <w:tblPr>
@@ -4579,6 +8119,7 @@
         <w:pStyle w:val="Heading3"/>
         <w:spacing w:after="100" w:before="200"/>
       </w:pPr>
+      <w:bookmarkStart w:id="19" w:name="_Toc191"/>
       <w:r>
         <w:rPr>
           <w:b/>
@@ -4590,6 +8131,7 @@
         </w:rPr>
         <w:t xml:space="preserve">UC-06 — Cấu hình nhiều vòng thi trong sự kiện</w:t>
       </w:r>
+      <w:bookmarkEnd w:id="19"/>
     </w:p>
     <w:tbl>
       <w:tblPr>
@@ -5009,6 +8551,7 @@
         <w:pStyle w:val="Heading2"/>
         <w:spacing w:after="140" w:before="260"/>
       </w:pPr>
+      <w:bookmarkStart w:id="20" w:name="_Toc207"/>
       <w:r>
         <w:rPr>
           <w:b/>
@@ -5019,12 +8562,14 @@
         </w:rPr>
         <w:t xml:space="preserve">3.3. Mô-đun Quản lý tiêu chí chấm điểm</w:t>
       </w:r>
+      <w:bookmarkEnd w:id="20"/>
     </w:p>
     <w:p>
       <w:pPr>
         <w:pStyle w:val="Heading3"/>
         <w:spacing w:after="100" w:before="200"/>
       </w:pPr>
+      <w:bookmarkStart w:id="21" w:name="_Toc208"/>
       <w:r>
         <w:rPr>
           <w:b/>
@@ -5036,6 +8581,7 @@
         </w:rPr>
         <w:t xml:space="preserve">UC-07 — Duy trì mẫu tiêu chí mặc định (Criteria Template)</w:t>
       </w:r>
+      <w:bookmarkEnd w:id="21"/>
     </w:p>
     <w:tbl>
       <w:tblPr>
@@ -5455,6 +9001,7 @@
         <w:pStyle w:val="Heading3"/>
         <w:spacing w:after="100" w:before="200"/>
       </w:pPr>
+      <w:bookmarkStart w:id="22" w:name="_Toc224"/>
       <w:r>
         <w:rPr>
           <w:b/>
@@ -5466,6 +9013,7 @@
         </w:rPr>
         <w:t xml:space="preserve">UC-08 — Tùy chỉnh tiêu chí theo sự kiện</w:t>
       </w:r>
+      <w:bookmarkEnd w:id="22"/>
     </w:p>
     <w:tbl>
       <w:tblPr>
@@ -5885,6 +9433,7 @@
         <w:pStyle w:val="Heading2"/>
         <w:spacing w:after="140" w:before="260"/>
       </w:pPr>
+      <w:bookmarkStart w:id="23" w:name="_Toc240"/>
       <w:r>
         <w:rPr>
           <w:b/>
@@ -5895,12 +9444,14 @@
         </w:rPr>
         <w:t xml:space="preserve">3.4. Mô-đun Quản lý hạng mục (Track)</w:t>
       </w:r>
+      <w:bookmarkEnd w:id="23"/>
     </w:p>
     <w:p>
       <w:pPr>
         <w:pStyle w:val="Heading3"/>
         <w:spacing w:after="100" w:before="200"/>
       </w:pPr>
+      <w:bookmarkStart w:id="24" w:name="_Toc241"/>
       <w:r>
         <w:rPr>
           <w:b/>
@@ -5912,6 +9463,7 @@
         </w:rPr>
         <w:t xml:space="preserve">UC-09 — Tạo Hạng mục thi đấu</w:t>
       </w:r>
+      <w:bookmarkEnd w:id="24"/>
     </w:p>
     <w:tbl>
       <w:tblPr>
@@ -6331,6 +9883,7 @@
         <w:pStyle w:val="Heading3"/>
         <w:spacing w:after="100" w:before="200"/>
       </w:pPr>
+      <w:bookmarkStart w:id="25" w:name="_Toc257"/>
       <w:r>
         <w:rPr>
           <w:b/>
@@ -6342,6 +9895,7 @@
         </w:rPr>
         <w:t xml:space="preserve">UC-10 — Phân công Mentor cho Hạng mục</w:t>
       </w:r>
+      <w:bookmarkEnd w:id="25"/>
     </w:p>
     <w:tbl>
       <w:tblPr>
@@ -6761,6 +10315,7 @@
         <w:pStyle w:val="Heading2"/>
         <w:spacing w:after="140" w:before="260"/>
       </w:pPr>
+      <w:bookmarkStart w:id="26" w:name="_Toc273"/>
       <w:r>
         <w:rPr>
           <w:b/>
@@ -6771,12 +10326,14 @@
         </w:rPr>
         <w:t xml:space="preserve">3.5. Mô-đun Quản lý đội thi</w:t>
       </w:r>
+      <w:bookmarkEnd w:id="26"/>
     </w:p>
     <w:p>
       <w:pPr>
         <w:pStyle w:val="Heading3"/>
         <w:spacing w:after="100" w:before="200"/>
       </w:pPr>
+      <w:bookmarkStart w:id="27" w:name="_Toc274"/>
       <w:r>
         <w:rPr>
           <w:b/>
@@ -6788,6 +10345,7 @@
         </w:rPr>
         <w:t xml:space="preserve">UC-11 — Thành lập đội thi</w:t>
       </w:r>
+      <w:bookmarkEnd w:id="27"/>
     </w:p>
     <w:tbl>
       <w:tblPr>
@@ -7207,6 +10765,7 @@
         <w:pStyle w:val="Heading3"/>
         <w:spacing w:after="100" w:before="200"/>
       </w:pPr>
+      <w:bookmarkStart w:id="28" w:name="_Toc290"/>
       <w:r>
         <w:rPr>
           <w:b/>
@@ -7218,6 +10777,7 @@
         </w:rPr>
         <w:t xml:space="preserve">UC-12 — Đăng ký đội vào Hạng mục</w:t>
       </w:r>
+      <w:bookmarkEnd w:id="28"/>
     </w:p>
     <w:tbl>
       <w:tblPr>
@@ -7637,6 +11197,7 @@
         <w:pStyle w:val="Heading2"/>
         <w:spacing w:after="140" w:before="260"/>
       </w:pPr>
+      <w:bookmarkStart w:id="29" w:name="_Toc306"/>
       <w:r>
         <w:rPr>
           <w:b/>
@@ -7647,12 +11208,14 @@
         </w:rPr>
         <w:t xml:space="preserve">3.6. Mô-đun Nộp bài (Submission)</w:t>
       </w:r>
+      <w:bookmarkEnd w:id="29"/>
     </w:p>
     <w:p>
       <w:pPr>
         <w:pStyle w:val="Heading3"/>
         <w:spacing w:after="100" w:before="200"/>
       </w:pPr>
+      <w:bookmarkStart w:id="30" w:name="_Toc307"/>
       <w:r>
         <w:rPr>
           <w:b/>
@@ -7664,6 +11227,7 @@
         </w:rPr>
         <w:t xml:space="preserve">UC-13 — Nộp bài dự thi theo vòng</w:t>
       </w:r>
+      <w:bookmarkEnd w:id="30"/>
     </w:p>
     <w:tbl>
       <w:tblPr>
@@ -8083,6 +11647,7 @@
         <w:pStyle w:val="Heading3"/>
         <w:spacing w:after="100" w:before="200"/>
       </w:pPr>
+      <w:bookmarkStart w:id="31" w:name="_Toc323"/>
       <w:r>
         <w:rPr>
           <w:b/>
@@ -8094,6 +11659,7 @@
         </w:rPr>
         <w:t xml:space="preserve">UC-14 — Tự động lấy metadata repository (tuỳ chọn)</w:t>
       </w:r>
+      <w:bookmarkEnd w:id="31"/>
     </w:p>
     <w:tbl>
       <w:tblPr>
@@ -8513,6 +12079,7 @@
         <w:pStyle w:val="Heading2"/>
         <w:spacing w:after="140" w:before="260"/>
       </w:pPr>
+      <w:bookmarkStart w:id="32" w:name="_Toc339"/>
       <w:r>
         <w:rPr>
           <w:b/>
@@ -8523,12 +12090,14 @@
         </w:rPr>
         <w:t xml:space="preserve">3.7. Mô-đun Đánh giá (Chấm điểm)</w:t>
       </w:r>
+      <w:bookmarkEnd w:id="32"/>
     </w:p>
     <w:p>
       <w:pPr>
         <w:pStyle w:val="Heading3"/>
         <w:spacing w:after="100" w:before="200"/>
       </w:pPr>
+      <w:bookmarkStart w:id="33" w:name="_Toc340"/>
       <w:r>
         <w:rPr>
           <w:b/>
@@ -8540,6 +12109,7 @@
         </w:rPr>
         <w:t xml:space="preserve">UC-15 — Phân công Giám khảo cho vòng thi</w:t>
       </w:r>
+      <w:bookmarkEnd w:id="33"/>
     </w:p>
     <w:tbl>
       <w:tblPr>
@@ -8959,6 +12529,7 @@
         <w:pStyle w:val="Heading3"/>
         <w:spacing w:after="100" w:before="200"/>
       </w:pPr>
+      <w:bookmarkStart w:id="34" w:name="_Toc356"/>
       <w:r>
         <w:rPr>
           <w:b/>
@@ -8970,6 +12541,7 @@
         </w:rPr>
         <w:t xml:space="preserve">UC-16 — Chấm điểm bài nộp</w:t>
       </w:r>
+      <w:bookmarkEnd w:id="34"/>
     </w:p>
     <w:tbl>
       <w:tblPr>
@@ -9389,6 +12961,7 @@
         <w:pStyle w:val="Heading2"/>
         <w:spacing w:after="140" w:before="260"/>
       </w:pPr>
+      <w:bookmarkStart w:id="35" w:name="_Toc372"/>
       <w:r>
         <w:rPr>
           <w:b/>
@@ -9399,12 +12972,14 @@
         </w:rPr>
         <w:t xml:space="preserve">3.8. Mô-đun Chấm điểm, Xếp hạng &amp; Loại</w:t>
       </w:r>
+      <w:bookmarkEnd w:id="35"/>
     </w:p>
     <w:p>
       <w:pPr>
         <w:pStyle w:val="Heading3"/>
         <w:spacing w:after="100" w:before="200"/>
       </w:pPr>
+      <w:bookmarkStart w:id="36" w:name="_Toc373"/>
       <w:r>
         <w:rPr>
           <w:b/>
@@ -9416,6 +12991,7 @@
         </w:rPr>
         <w:t xml:space="preserve">UC-17 — Tự động xếp hạng đội thi</w:t>
       </w:r>
+      <w:bookmarkEnd w:id="36"/>
     </w:p>
     <w:tbl>
       <w:tblPr>
@@ -9835,6 +13411,7 @@
         <w:pStyle w:val="Heading3"/>
         <w:spacing w:after="100" w:before="200"/>
       </w:pPr>
+      <w:bookmarkStart w:id="37" w:name="_Toc389"/>
       <w:r>
         <w:rPr>
           <w:b/>
@@ -9846,6 +13423,7 @@
         </w:rPr>
         <w:t xml:space="preserve">UC-18 — Tính toán thăng vòng</w:t>
       </w:r>
+      <w:bookmarkEnd w:id="37"/>
     </w:p>
     <w:tbl>
       <w:tblPr>
@@ -10265,6 +13843,7 @@
         <w:pStyle w:val="Heading3"/>
         <w:spacing w:after="100" w:before="200"/>
       </w:pPr>
+      <w:bookmarkStart w:id="38" w:name="_Toc405"/>
       <w:r>
         <w:rPr>
           <w:b/>
@@ -10276,6 +13855,7 @@
         </w:rPr>
         <w:t xml:space="preserve">UC-19 — Loại đội / bài nộp vi phạm quy chế</w:t>
       </w:r>
+      <w:bookmarkEnd w:id="38"/>
     </w:p>
     <w:tbl>
       <w:tblPr>
@@ -10695,6 +14275,7 @@
         <w:pStyle w:val="Heading3"/>
         <w:spacing w:after="100" w:before="200"/>
       </w:pPr>
+      <w:bookmarkStart w:id="39" w:name="_Toc421"/>
       <w:r>
         <w:rPr>
           <w:b/>
@@ -10706,6 +14287,7 @@
         </w:rPr>
         <w:t xml:space="preserve">UC-20 — Nhật ký kiểm tra chấm điểm &amp; loại đội (Audit Log)</w:t>
       </w:r>
+      <w:bookmarkEnd w:id="39"/>
     </w:p>
     <w:tbl>
       <w:tblPr>
@@ -11125,6 +14707,7 @@
         <w:pStyle w:val="Heading2"/>
         <w:spacing w:after="140" w:before="260"/>
       </w:pPr>
+      <w:bookmarkStart w:id="40" w:name="_Toc437"/>
       <w:r>
         <w:rPr>
           <w:b/>
@@ -11135,6 +14718,7 @@
         </w:rPr>
         <w:t xml:space="preserve">3.9. Mô-đun Thu thập dữ liệu nghiên cứu (RBL)</w:t>
       </w:r>
+      <w:bookmarkEnd w:id="40"/>
     </w:p>
     <w:p>
       <w:pPr>
@@ -11154,6 +14738,7 @@
         <w:pStyle w:val="Heading3"/>
         <w:spacing w:after="100" w:before="200"/>
       </w:pPr>
+      <w:bookmarkStart w:id="41" w:name="_Toc439"/>
       <w:r>
         <w:rPr>
           <w:b/>
@@ -11165,6 +14750,7 @@
         </w:rPr>
         <w:t xml:space="preserve">UC-21 — Ghi điểm chi tiết từng giám khảo/tiêu chí (không gộp)</w:t>
       </w:r>
+      <w:bookmarkEnd w:id="41"/>
     </w:p>
     <w:tbl>
       <w:tblPr>
@@ -11584,6 +15170,7 @@
         <w:pStyle w:val="Heading3"/>
         <w:spacing w:after="100" w:before="200"/>
       </w:pPr>
+      <w:bookmarkStart w:id="42" w:name="_Toc455"/>
       <w:r>
         <w:rPr>
           <w:b/>
@@ -11595,6 +15182,7 @@
         </w:rPr>
         <w:t xml:space="preserve">UC-22 — Vòng hiệu chuẩn (Calibration Round)</w:t>
       </w:r>
+      <w:bookmarkEnd w:id="42"/>
     </w:p>
     <w:tbl>
       <w:tblPr>
@@ -12014,6 +15602,7 @@
         <w:pStyle w:val="Heading3"/>
         <w:spacing w:after="100" w:before="200"/>
       </w:pPr>
+      <w:bookmarkStart w:id="43" w:name="_Toc471"/>
       <w:r>
         <w:rPr>
           <w:b/>
@@ -12025,6 +15614,7 @@
         </w:rPr>
         <w:t xml:space="preserve">UC-23 — Xuất dữ liệu chấm điểm đã ẩn danh (CSV)</w:t>
       </w:r>
+      <w:bookmarkEnd w:id="43"/>
     </w:p>
     <w:tbl>
       <w:tblPr>
@@ -12444,6 +16034,7 @@
         <w:pStyle w:val="Heading3"/>
         <w:spacing w:after="100" w:before="200"/>
       </w:pPr>
+      <w:bookmarkStart w:id="44" w:name="_Toc487"/>
       <w:r>
         <w:rPr>
           <w:b/>
@@ -12455,6 +16046,7 @@
         </w:rPr>
         <w:t xml:space="preserve">UC-24 — Dashboard phương sai điểm giữa các giám khảo</w:t>
       </w:r>
+      <w:bookmarkEnd w:id="44"/>
     </w:p>
     <w:tbl>
       <w:tblPr>
@@ -12874,6 +16466,7 @@
         <w:pStyle w:val="Heading2"/>
         <w:spacing w:after="140" w:before="260"/>
       </w:pPr>
+      <w:bookmarkStart w:id="45" w:name="_Toc503"/>
       <w:r>
         <w:rPr>
           <w:b/>
@@ -12884,12 +16477,14 @@
         </w:rPr>
         <w:t xml:space="preserve">3.10. Mô-đun Giải thưởng &amp; Thông báo kết quả</w:t>
       </w:r>
+      <w:bookmarkEnd w:id="45"/>
     </w:p>
     <w:p>
       <w:pPr>
         <w:pStyle w:val="Heading3"/>
         <w:spacing w:after="100" w:before="200"/>
       </w:pPr>
+      <w:bookmarkStart w:id="46" w:name="_Toc504"/>
       <w:r>
         <w:rPr>
           <w:b/>
@@ -12901,6 +16496,7 @@
         </w:rPr>
         <w:t xml:space="preserve">UC-25 — Trao giải dựa trên kết quả xếp hạng</w:t>
       </w:r>
+      <w:bookmarkEnd w:id="46"/>
     </w:p>
     <w:tbl>
       <w:tblPr>
@@ -13320,6 +16916,7 @@
         <w:pStyle w:val="Heading3"/>
         <w:spacing w:after="100" w:before="200"/>
       </w:pPr>
+      <w:bookmarkStart w:id="47" w:name="_Toc520"/>
       <w:r>
         <w:rPr>
           <w:b/>
@@ -13331,6 +16928,7 @@
         </w:rPr>
         <w:t xml:space="preserve">UC-26 — Thông báo &amp; công bố kết quả</w:t>
       </w:r>
+      <w:bookmarkEnd w:id="47"/>
     </w:p>
     <w:tbl>
       <w:tblPr>
@@ -13750,6 +17348,7 @@
         <w:pStyle w:val="Heading3"/>
         <w:spacing w:after="100" w:before="200"/>
       </w:pPr>
+      <w:bookmarkStart w:id="48" w:name="_Toc536"/>
       <w:r>
         <w:rPr>
           <w:b/>
@@ -13761,6 +17360,7 @@
         </w:rPr>
         <w:t xml:space="preserve">UC-27 — Xuất báo cáo xếp hạng và điểm (CSV/Excel)</w:t>
       </w:r>
+      <w:bookmarkEnd w:id="48"/>
     </w:p>
     <w:tbl>
       <w:tblPr>
@@ -14185,6 +17785,7 @@
         <w:pStyle w:val="Heading1"/>
         <w:spacing w:after="200" w:before="360"/>
       </w:pPr>
+      <w:bookmarkStart w:id="49" w:name="_Toc553"/>
       <w:r>
         <w:rPr>
           <w:b/>
@@ -14195,6 +17796,7 @@
         </w:rPr>
         <w:t xml:space="preserve">4. MA TRẬN PHÂN QUYỀN (ROLE-BASED ACCESS MATRIX)</w:t>
       </w:r>
+      <w:bookmarkEnd w:id="49"/>
     </w:p>
     <w:p>
       <w:pPr>
@@ -17150,6 +20752,7 @@
         <w:pStyle w:val="Heading1"/>
         <w:spacing w:after="200" w:before="360"/>
       </w:pPr>
+      <w:bookmarkStart w:id="50" w:name="_Toc664"/>
       <w:r>
         <w:rPr>
           <w:b/>
@@ -17160,12 +20763,14 @@
         </w:rPr>
         <w:t xml:space="preserve">5. YÊU CẦU PHI CHỨC NĂNG</w:t>
       </w:r>
+      <w:bookmarkEnd w:id="50"/>
     </w:p>
     <w:p>
       <w:pPr>
         <w:pStyle w:val="Heading2"/>
         <w:spacing w:after="140" w:before="260"/>
       </w:pPr>
+      <w:bookmarkStart w:id="51" w:name="_Toc665"/>
       <w:r>
         <w:rPr>
           <w:b/>
@@ -17176,6 +20781,7 @@
         </w:rPr>
         <w:t xml:space="preserve">5.1. Bảo mật</w:t>
       </w:r>
+      <w:bookmarkEnd w:id="51"/>
     </w:p>
     <w:p>
       <w:pPr>
@@ -17250,6 +20856,7 @@
         <w:pStyle w:val="Heading2"/>
         <w:spacing w:after="140" w:before="260"/>
       </w:pPr>
+      <w:bookmarkStart w:id="52" w:name="_Toc670"/>
       <w:r>
         <w:rPr>
           <w:b/>
@@ -17260,6 +20867,7 @@
         </w:rPr>
         <w:t xml:space="preserve">5.2. Hiệu năng</w:t>
       </w:r>
+      <w:bookmarkEnd w:id="52"/>
     </w:p>
     <w:p>
       <w:pPr>
@@ -17300,6 +20908,7 @@
         <w:pStyle w:val="Heading2"/>
         <w:spacing w:after="140" w:before="260"/>
       </w:pPr>
+      <w:bookmarkStart w:id="53" w:name="_Toc673"/>
       <w:r>
         <w:rPr>
           <w:b/>
@@ -17310,6 +20919,7 @@
         </w:rPr>
         <w:t xml:space="preserve">5.3. Khả năng mở rộng &amp; bảo trì</w:t>
       </w:r>
+      <w:bookmarkEnd w:id="53"/>
     </w:p>
     <w:p>
       <w:pPr>
@@ -17350,6 +20960,7 @@
         <w:pStyle w:val="Heading2"/>
         <w:spacing w:after="140" w:before="260"/>
       </w:pPr>
+      <w:bookmarkStart w:id="54" w:name="_Toc676"/>
       <w:r>
         <w:rPr>
           <w:b/>
@@ -17360,6 +20971,7 @@
         </w:rPr>
         <w:t xml:space="preserve">5.4. Khả dụng &amp; sao lưu dữ liệu</w:t>
       </w:r>
+      <w:bookmarkEnd w:id="54"/>
     </w:p>
     <w:p>
       <w:pPr>
@@ -17400,6 +21012,7 @@
         <w:pStyle w:val="Heading2"/>
         <w:spacing w:after="140" w:before="260"/>
       </w:pPr>
+      <w:bookmarkStart w:id="55" w:name="_Toc679"/>
       <w:r>
         <w:rPr>
           <w:b/>
@@ -17410,6 +21023,7 @@
         </w:rPr>
         <w:t xml:space="preserve">5.5. Nhật ký kiểm tra &amp; minh bạch</w:t>
       </w:r>
+      <w:bookmarkEnd w:id="55"/>
     </w:p>
     <w:p>
       <w:pPr>
@@ -17450,6 +21064,7 @@
         <w:pStyle w:val="Heading2"/>
         <w:spacing w:after="140" w:before="260"/>
       </w:pPr>
+      <w:bookmarkStart w:id="56" w:name="_Toc682"/>
       <w:r>
         <w:rPr>
           <w:b/>
@@ -17460,6 +21075,7 @@
         </w:rPr>
         <w:t xml:space="preserve">5.6. Khả năng sử dụng (Usability)</w:t>
       </w:r>
+      <w:bookmarkEnd w:id="56"/>
     </w:p>
     <w:p>
       <w:pPr>
@@ -17500,6 +21116,7 @@
         <w:pStyle w:val="Heading2"/>
         <w:spacing w:after="140" w:before="260"/>
       </w:pPr>
+      <w:bookmarkStart w:id="57" w:name="_Toc685"/>
       <w:r>
         <w:rPr>
           <w:b/>
@@ -17510,6 +21127,7 @@
         </w:rPr>
         <w:t xml:space="preserve">5.7. Quốc tế hoá &amp; ngôn ngữ</w:t>
       </w:r>
+      <w:bookmarkEnd w:id="57"/>
     </w:p>
     <w:p>
       <w:pPr>
@@ -17538,6 +21156,7 @@
         <w:pStyle w:val="Heading1"/>
         <w:spacing w:after="200" w:before="360"/>
       </w:pPr>
+      <w:bookmarkStart w:id="58" w:name="_Toc688"/>
       <w:r>
         <w:rPr>
           <w:b/>
@@ -17548,6 +21167,7 @@
         </w:rPr>
         <w:t xml:space="preserve">6. MÔ HÌNH DỮ LIỆU (DOMAIN MODEL)</w:t>
       </w:r>
+      <w:bookmarkEnd w:id="58"/>
     </w:p>
     <w:p>
       <w:pPr>
@@ -17567,6 +21187,7 @@
         <w:pStyle w:val="Heading2"/>
         <w:spacing w:after="140" w:before="260"/>
       </w:pPr>
+      <w:bookmarkStart w:id="59" w:name="_Toc690"/>
       <w:r>
         <w:rPr>
           <w:b/>
@@ -17577,12 +21198,14 @@
         </w:rPr>
         <w:t xml:space="preserve">6.1. Danh sách thực thể chính</w:t>
       </w:r>
+      <w:bookmarkEnd w:id="59"/>
     </w:p>
     <w:p>
       <w:pPr>
         <w:pStyle w:val="Heading3"/>
         <w:spacing w:after="100" w:before="200"/>
       </w:pPr>
+      <w:bookmarkStart w:id="60" w:name="_Toc691"/>
       <w:r>
         <w:rPr>
           <w:b/>
@@ -17594,6 +21217,7 @@
         </w:rPr>
         <w:t xml:space="preserve">User (Người dùng)</w:t>
       </w:r>
+      <w:bookmarkEnd w:id="60"/>
     </w:p>
     <w:tbl>
       <w:tblPr>
@@ -18522,6 +22146,7 @@
         <w:pStyle w:val="Heading3"/>
         <w:spacing w:after="100" w:before="200"/>
       </w:pPr>
+      <w:bookmarkStart w:id="61" w:name="_Toc725"/>
       <w:r>
         <w:rPr>
           <w:b/>
@@ -18533,6 +22158,7 @@
         </w:rPr>
         <w:t xml:space="preserve">Role &amp; UserRoleAssignment (Vai trò &amp; Phân công vai trò)</w:t>
       </w:r>
+      <w:bookmarkEnd w:id="61"/>
     </w:p>
     <w:tbl>
       <w:tblPr>
@@ -19135,6 +22761,7 @@
         <w:pStyle w:val="Heading3"/>
         <w:spacing w:after="100" w:before="200"/>
       </w:pPr>
+      <w:bookmarkStart w:id="62" w:name="_Toc747"/>
       <w:r>
         <w:rPr>
           <w:b/>
@@ -19146,6 +22773,7 @@
         </w:rPr>
         <w:t xml:space="preserve">HackathonEvent (Sự kiện)</w:t>
       </w:r>
+      <w:bookmarkEnd w:id="62"/>
     </w:p>
     <w:tbl>
       <w:tblPr>
@@ -19748,6 +23376,7 @@
         <w:pStyle w:val="Heading3"/>
         <w:spacing w:after="100" w:before="200"/>
       </w:pPr>
+      <w:bookmarkStart w:id="63" w:name="_Toc769"/>
       <w:r>
         <w:rPr>
           <w:b/>
@@ -19759,6 +23388,7 @@
         </w:rPr>
         <w:t xml:space="preserve">Track (Hạng mục)</w:t>
       </w:r>
+      <w:bookmarkEnd w:id="63"/>
     </w:p>
     <w:tbl>
       <w:tblPr>
@@ -20278,6 +23908,7 @@
         <w:pStyle w:val="Heading3"/>
         <w:spacing w:after="100" w:before="200"/>
       </w:pPr>
+      <w:bookmarkStart w:id="64" w:name="_Toc788"/>
       <w:r>
         <w:rPr>
           <w:b/>
@@ -20289,6 +23920,7 @@
         </w:rPr>
         <w:t xml:space="preserve">Round (Vòng thi)</w:t>
       </w:r>
+      <w:bookmarkEnd w:id="64"/>
     </w:p>
     <w:tbl>
       <w:tblPr>
@@ -20891,6 +24523,7 @@
         <w:pStyle w:val="Heading3"/>
         <w:spacing w:after="100" w:before="200"/>
       </w:pPr>
+      <w:bookmarkStart w:id="65" w:name="_Toc810"/>
       <w:r>
         <w:rPr>
           <w:b/>
@@ -20902,6 +24535,7 @@
         </w:rPr>
         <w:t xml:space="preserve">CriteriaTemplate &amp; Criterion (Mẫu &amp; Tiêu chí chấm điểm)</w:t>
       </w:r>
+      <w:bookmarkEnd w:id="65"/>
     </w:p>
     <w:tbl>
       <w:tblPr>
@@ -21504,6 +25138,7 @@
         <w:pStyle w:val="Heading3"/>
         <w:spacing w:after="100" w:before="200"/>
       </w:pPr>
+      <w:bookmarkStart w:id="66" w:name="_Toc832"/>
       <w:r>
         <w:rPr>
           <w:b/>
@@ -21515,6 +25150,7 @@
         </w:rPr>
         <w:t xml:space="preserve">Team &amp; TeamMember (Đội thi &amp; Thành viên)</w:t>
       </w:r>
+      <w:bookmarkEnd w:id="66"/>
     </w:p>
     <w:tbl>
       <w:tblPr>
@@ -22117,6 +25753,7 @@
         <w:pStyle w:val="Heading3"/>
         <w:spacing w:after="100" w:before="200"/>
       </w:pPr>
+      <w:bookmarkStart w:id="67" w:name="_Toc854"/>
       <w:r>
         <w:rPr>
           <w:b/>
@@ -22128,6 +25765,7 @@
         </w:rPr>
         <w:t xml:space="preserve">Submission (Bài nộp)</w:t>
       </w:r>
+      <w:bookmarkEnd w:id="67"/>
     </w:p>
     <w:tbl>
       <w:tblPr>
@@ -22730,6 +26368,7 @@
         <w:pStyle w:val="Heading3"/>
         <w:spacing w:after="100" w:before="200"/>
       </w:pPr>
+      <w:bookmarkStart w:id="68" w:name="_Toc876"/>
       <w:r>
         <w:rPr>
           <w:b/>
@@ -22741,6 +26380,7 @@
         </w:rPr>
         <w:t xml:space="preserve">Score (Điểm chấm — mức chi tiết nhất)</w:t>
       </w:r>
+      <w:bookmarkEnd w:id="68"/>
     </w:p>
     <w:tbl>
       <w:tblPr>
@@ -23343,6 +26983,7 @@
         <w:pStyle w:val="Heading3"/>
         <w:spacing w:after="100" w:before="200"/>
       </w:pPr>
+      <w:bookmarkStart w:id="69" w:name="_Toc898"/>
       <w:r>
         <w:rPr>
           <w:b/>
@@ -23354,6 +26995,7 @@
         </w:rPr>
         <w:t xml:space="preserve">Ranking (Xếp hạng — dữ liệu tổng hợp)</w:t>
       </w:r>
+      <w:bookmarkEnd w:id="69"/>
     </w:p>
     <w:tbl>
       <w:tblPr>
@@ -23873,6 +27515,7 @@
         <w:pStyle w:val="Heading3"/>
         <w:spacing w:after="100" w:before="200"/>
       </w:pPr>
+      <w:bookmarkStart w:id="70" w:name="_Toc917"/>
       <w:r>
         <w:rPr>
           <w:b/>
@@ -23884,6 +27527,7 @@
         </w:rPr>
         <w:t xml:space="preserve">Disqualification (Loại đội/bài nộp) &amp; AuditLog</w:t>
       </w:r>
+      <w:bookmarkEnd w:id="70"/>
     </w:p>
     <w:tbl>
       <w:tblPr>
@@ -24566,6 +28210,7 @@
         <w:pStyle w:val="Heading3"/>
         <w:spacing w:after="100" w:before="200"/>
       </w:pPr>
+      <w:bookmarkStart w:id="71" w:name="_Toc942"/>
       <w:r>
         <w:rPr>
           <w:b/>
@@ -24577,6 +28222,7 @@
         </w:rPr>
         <w:t xml:space="preserve">Prize (Giải thưởng)</w:t>
       </w:r>
+      <w:bookmarkEnd w:id="71"/>
     </w:p>
     <w:tbl>
       <w:tblPr>
@@ -25096,6 +28742,7 @@
         <w:pStyle w:val="Heading3"/>
         <w:spacing w:after="100" w:before="200"/>
       </w:pPr>
+      <w:bookmarkStart w:id="72" w:name="_Toc961"/>
       <w:r>
         <w:rPr>
           <w:b/>
@@ -25107,6 +28754,7 @@
         </w:rPr>
         <w:t xml:space="preserve">CalibrationRound &amp; CalibrationScore (phục vụ RBL)</w:t>
       </w:r>
+      <w:bookmarkEnd w:id="72"/>
     </w:p>
     <w:tbl>
       <w:tblPr>
@@ -25463,6 +29111,7 @@
         <w:pStyle w:val="Heading2"/>
         <w:spacing w:after="140" w:before="260"/>
       </w:pPr>
+      <w:bookmarkStart w:id="73" w:name="_Toc974"/>
       <w:r>
         <w:rPr>
           <w:b/>
@@ -25473,6 +29122,7 @@
         </w:rPr>
         <w:t xml:space="preserve">6.2. Quan hệ giữa các thực thể (tóm tắt)</w:t>
       </w:r>
+      <w:bookmarkEnd w:id="73"/>
     </w:p>
     <w:tbl>
       <w:tblPr>
@@ -26235,6 +29885,7 @@
         <w:pStyle w:val="Heading1"/>
         <w:spacing w:after="200" w:before="360"/>
       </w:pPr>
+      <w:bookmarkStart w:id="74" w:name="_Toc1003"/>
       <w:r>
         <w:rPr>
           <w:b/>
@@ -26245,12 +29896,14 @@
         </w:rPr>
         <w:t xml:space="preserve">7. KIẾN TRÚC HỆ THỐNG ĐỀ XUẤT</w:t>
       </w:r>
+      <w:bookmarkEnd w:id="74"/>
     </w:p>
     <w:p>
       <w:pPr>
         <w:pStyle w:val="Heading2"/>
         <w:spacing w:after="140" w:before="260"/>
       </w:pPr>
+      <w:bookmarkStart w:id="75" w:name="_Toc1004"/>
       <w:r>
         <w:rPr>
           <w:b/>
@@ -26261,6 +29914,7 @@
         </w:rPr>
         <w:t xml:space="preserve">7.1. Kiến trúc tổng quan</w:t>
       </w:r>
+      <w:bookmarkEnd w:id="75"/>
     </w:p>
     <w:p>
       <w:pPr>
@@ -26331,6 +29985,7 @@
         <w:pStyle w:val="Heading2"/>
         <w:spacing w:after="140" w:before="260"/>
       </w:pPr>
+      <w:bookmarkStart w:id="76" w:name="_Toc1009"/>
       <w:r>
         <w:rPr>
           <w:b/>
@@ -26341,6 +29996,7 @@
         </w:rPr>
         <w:t xml:space="preserve">7.2. Công nghệ đề xuất</w:t>
       </w:r>
+      <w:bookmarkEnd w:id="76"/>
     </w:p>
     <w:tbl>
       <w:tblPr>
@@ -27023,6 +30679,7 @@
         <w:pStyle w:val="Heading2"/>
         <w:spacing w:after="140" w:before="260"/>
       </w:pPr>
+      <w:bookmarkStart w:id="77" w:name="_Toc1034"/>
       <w:r>
         <w:rPr>
           <w:b/>
@@ -27033,6 +30690,7 @@
         </w:rPr>
         <w:t xml:space="preserve">7.3. Luồng nghiệp vụ tổng quát</w:t>
       </w:r>
+      <w:bookmarkEnd w:id="77"/>
     </w:p>
     <w:p>
       <w:pPr>
@@ -27057,6 +30715,7 @@
         <w:pStyle w:val="Heading1"/>
         <w:spacing w:after="200" w:before="360"/>
       </w:pPr>
+      <w:bookmarkStart w:id="78" w:name="_Toc1037"/>
       <w:r>
         <w:rPr>
           <w:b/>
@@ -27067,12 +30726,14 @@
         </w:rPr>
         <w:t xml:space="preserve">8. THÀNH PHẦN NGHIÊN CỨU (RESEARCH-BASED LEARNING)</w:t>
       </w:r>
+      <w:bookmarkEnd w:id="78"/>
     </w:p>
     <w:p>
       <w:pPr>
         <w:pStyle w:val="Heading2"/>
         <w:spacing w:after="140" w:before="260"/>
       </w:pPr>
+      <w:bookmarkStart w:id="79" w:name="_Toc1038"/>
       <w:r>
         <w:rPr>
           <w:b/>
@@ -27083,6 +30744,7 @@
         </w:rPr>
         <w:t xml:space="preserve">8.1. Câu hỏi nghiên cứu</w:t>
       </w:r>
+      <w:bookmarkEnd w:id="79"/>
     </w:p>
     <w:p>
       <w:pPr>
@@ -27164,6 +30826,7 @@
         <w:pStyle w:val="Heading2"/>
         <w:spacing w:after="140" w:before="260"/>
       </w:pPr>
+      <w:bookmarkStart w:id="80" w:name="_Toc1043"/>
       <w:r>
         <w:rPr>
           <w:b/>
@@ -27174,6 +30837,7 @@
         </w:rPr>
         <w:t xml:space="preserve">8.2. Phương pháp thu thập dữ liệu</w:t>
       </w:r>
+      <w:bookmarkEnd w:id="80"/>
     </w:p>
     <w:p>
       <w:pPr>
@@ -27261,6 +30925,7 @@
         <w:pStyle w:val="Heading2"/>
         <w:spacing w:after="140" w:before="260"/>
       </w:pPr>
+      <w:bookmarkStart w:id="81" w:name="_Toc1049"/>
       <w:r>
         <w:rPr>
           <w:b/>
@@ -27271,6 +30936,7 @@
         </w:rPr>
         <w:t xml:space="preserve">8.3. Phương pháp phân tích thống kê</w:t>
       </w:r>
+      <w:bookmarkEnd w:id="81"/>
     </w:p>
     <w:tbl>
       <w:tblPr>
@@ -27710,6 +31376,7 @@
         <w:pStyle w:val="Heading2"/>
         <w:spacing w:after="140" w:before="260"/>
       </w:pPr>
+      <w:bookmarkStart w:id="82" w:name="_Toc1065"/>
       <w:r>
         <w:rPr>
           <w:b/>
@@ -27720,6 +31387,7 @@
         </w:rPr>
         <w:t xml:space="preserve">8.4. Thiết kế hệ thống hỗ trợ nghiên cứu</w:t>
       </w:r>
+      <w:bookmarkEnd w:id="82"/>
     </w:p>
     <w:p>
       <w:pPr>
@@ -27794,6 +31462,7 @@
         <w:pStyle w:val="Heading2"/>
         <w:spacing w:after="140" w:before="260"/>
       </w:pPr>
+      <w:bookmarkStart w:id="83" w:name="_Toc1070"/>
       <w:r>
         <w:rPr>
           <w:b/>
@@ -27804,6 +31473,7 @@
         </w:rPr>
         <w:t xml:space="preserve">8.5. Đạo đức nghiên cứu và ẩn danh dữ liệu</w:t>
       </w:r>
+      <w:bookmarkEnd w:id="83"/>
     </w:p>
     <w:p>
       <w:pPr>
@@ -27866,6 +31536,7 @@
         <w:pStyle w:val="Heading1"/>
         <w:spacing w:after="200" w:before="360"/>
       </w:pPr>
+      <w:bookmarkStart w:id="84" w:name="_Toc1075"/>
       <w:r>
         <w:rPr>
           <w:b/>
@@ -27876,6 +31547,7 @@
         </w:rPr>
         <w:t xml:space="preserve">9. LỘ TRÌNH TRIỂN KHAI ĐỀ XUẤT</w:t>
       </w:r>
+      <w:bookmarkEnd w:id="84"/>
     </w:p>
     <w:p>
       <w:pPr>
@@ -28413,6 +32085,7 @@
         <w:pStyle w:val="Heading1"/>
         <w:spacing w:after="200" w:before="360"/>
       </w:pPr>
+      <w:bookmarkStart w:id="85" w:name="_Toc1096"/>
       <w:r>
         <w:rPr>
           <w:b/>
@@ -28423,6 +32096,7 @@
         </w:rPr>
         <w:t xml:space="preserve">10. TIÊU CHÍ NGHIỆM THU (DEFINITION OF DONE)</w:t>
       </w:r>
+      <w:bookmarkEnd w:id="85"/>
     </w:p>
     <w:p>
       <w:pPr>
@@ -28549,6 +32223,7 @@
         <w:pStyle w:val="Heading1"/>
         <w:spacing w:after="200" w:before="360"/>
       </w:pPr>
+      <w:bookmarkStart w:id="86" w:name="_Toc1105"/>
       <w:r>
         <w:rPr>
           <w:b/>
@@ -28559,6 +32234,7 @@
         </w:rPr>
         <w:t xml:space="preserve">11. RỦI RO VÀ BIỆN PHÁP GIẢM THIỂU</w:t>
       </w:r>
+      <w:bookmarkEnd w:id="86"/>
     </w:p>
     <w:tbl>
       <w:tblPr>
@@ -29083,6 +32759,7 @@
         <w:pStyle w:val="Heading1"/>
         <w:spacing w:after="200" w:before="360"/>
       </w:pPr>
+      <w:bookmarkStart w:id="87" w:name="_Toc1125"/>
       <w:r>
         <w:rPr>
           <w:b/>
@@ -29093,6 +32770,7 @@
         </w:rPr>
         <w:t xml:space="preserve">12. KẾT LUẬN</w:t>
       </w:r>
+      <w:bookmarkEnd w:id="87"/>
     </w:p>
     <w:p>
       <w:pPr>

</xml_diff>